<commit_message>
Update project README and research documents
</commit_message>
<xml_diff>
--- a/docs/EDA_Report_UniPlant_WA.docx
+++ b/docs/EDA_Report_UniPlant_WA.docx
@@ -4,29 +4,32 @@
   <w:body>
     <w:p>
       <w:pPr>
-        <w:spacing w:after="100"/>
+        <w:spacing w:after="100" w:line="480" w:lineRule="auto"/>
         <w:jc w:val="center"/>
       </w:pPr>
       <w:r>
         <w:rPr>
+          <w:rFonts w:ascii="Times New Roman" w:hAnsi="Times New Roman" w:eastAsia="Times New Roman" w:cs="Times New Roman"/>
           <w:b/>
           <w:bCs/>
-          <w:sz w:val="32"/>
-          <w:szCs w:val="32"/>
+          <w:sz w:val="28"/>
+          <w:szCs w:val="28"/>
+          <w:color w:val="000000"/>
         </w:rPr>
         <w:t>Data Acquisition &amp; Exploratory Data Analysis</w:t>
       </w:r>
     </w:p>
     <w:p>
       <w:pPr>
-        <w:spacing w:after="60"/>
+        <w:spacing w:after="60" w:line="480" w:lineRule="auto"/>
         <w:jc w:val="center"/>
       </w:pPr>
       <w:r>
         <w:rPr>
+          <w:rFonts w:ascii="Times New Roman" w:hAnsi="Times New Roman" w:eastAsia="Times New Roman" w:cs="Times New Roman"/>
           <w:i/>
           <w:iCs/>
-          <w:color w:val="555555"/>
+          <w:color w:val="000000"/>
           <w:sz w:val="24"/>
           <w:szCs w:val="24"/>
         </w:rPr>
@@ -35,14 +38,15 @@
     </w:p>
     <w:p>
       <w:pPr>
-        <w:spacing w:after="400"/>
+        <w:spacing w:after="400" w:line="480" w:lineRule="auto"/>
         <w:jc w:val="center"/>
       </w:pPr>
       <w:r>
         <w:rPr>
-          <w:color w:val="777777"/>
-          <w:sz w:val="20"/>
-          <w:szCs w:val="20"/>
+          <w:rFonts w:ascii="Times New Roman" w:hAnsi="Times New Roman" w:eastAsia="Times New Roman" w:cs="Times New Roman"/>
+          <w:color w:val="000000"/>
+          <w:sz w:val="24"/>
+          <w:szCs w:val="24"/>
         </w:rPr>
         <w:t>Team Architects | ML/DL Research Paper Assignment | ICT 324</w:t>
       </w:r>
@@ -50,17 +54,29 @@
     <w:p>
       <w:pPr>
         <w:pStyle w:val="2"/>
-        <w:spacing w:before="300" w:after="150"/>
-      </w:pPr>
-      <w:r>
+        <w:spacing w:before="300" w:after="150" w:line="480" w:lineRule="auto"/>
+      </w:pPr>
+      <w:r>
+        <w:rPr>
+          <w:rFonts w:ascii="Times New Roman" w:hAnsi="Times New Roman" w:eastAsia="Times New Roman" w:cs="Times New Roman"/>
+          <w:color w:val="000000"/>
+          <w:sz w:val="28"/>
+          <w:szCs w:val="28"/>
+        </w:rPr>
         <w:t>1. Data Acquisition</w:t>
       </w:r>
     </w:p>
     <w:p>
       <w:pPr>
-        <w:spacing w:after="160"/>
-      </w:pPr>
-      <w:r>
+        <w:spacing w:after="160" w:line="480" w:lineRule="auto"/>
+      </w:pPr>
+      <w:r>
+        <w:rPr>
+          <w:rFonts w:ascii="Times New Roman" w:hAnsi="Times New Roman" w:eastAsia="Times New Roman" w:cs="Times New Roman"/>
+          <w:color w:val="000000"/>
+          <w:sz w:val="24"/>
+          <w:szCs w:val="24"/>
+        </w:rPr>
         <w:t>Six crop-specific image datasets were sourced from three distinct repositories to support the “Universal Diagnostic Model for the Big Six West African Staples” research objective. Table 1 summarizes the source, class structure, and volume for each crop.</w:t>
       </w:r>
     </w:p>
@@ -111,14 +127,19 @@
         <w:tc>
           <w:tcPr>
             <w:tcW w:w="2200" w:type="dxa"/>
-            <w:shd w:val="clear" w:color="auto" w:fill="2F5233"/>
-          </w:tcPr>
-          <w:p>
-            <w:r>
-              <w:rPr>
+          </w:tcPr>
+          <w:p>
+            <w:pPr>
+              <w:spacing w:line="480" w:lineRule="auto"/>
+            </w:pPr>
+            <w:r>
+              <w:rPr>
+                <w:rFonts w:ascii="Times New Roman" w:hAnsi="Times New Roman" w:eastAsia="Times New Roman" w:cs="Times New Roman"/>
                 <w:b/>
                 <w:bCs/>
-                <w:color w:val="FFFFFF"/>
+                <w:color w:val="000000"/>
+                <w:sz w:val="24"/>
+                <w:szCs w:val="24"/>
               </w:rPr>
               <w:t>Crop</w:t>
             </w:r>
@@ -127,14 +148,19 @@
         <w:tc>
           <w:tcPr>
             <w:tcW w:w="4200" w:type="dxa"/>
-            <w:shd w:val="clear" w:color="auto" w:fill="2F5233"/>
-          </w:tcPr>
-          <w:p>
-            <w:r>
-              <w:rPr>
+          </w:tcPr>
+          <w:p>
+            <w:pPr>
+              <w:spacing w:line="480" w:lineRule="auto"/>
+            </w:pPr>
+            <w:r>
+              <w:rPr>
+                <w:rFonts w:ascii="Times New Roman" w:hAnsi="Times New Roman" w:eastAsia="Times New Roman" w:cs="Times New Roman"/>
                 <w:b/>
                 <w:bCs/>
-                <w:color w:val="FFFFFF"/>
+                <w:color w:val="000000"/>
+                <w:sz w:val="24"/>
+                <w:szCs w:val="24"/>
               </w:rPr>
               <w:t>Source</w:t>
             </w:r>
@@ -143,14 +169,19 @@
         <w:tc>
           <w:tcPr>
             <w:tcW w:w="1700" w:type="dxa"/>
-            <w:shd w:val="clear" w:color="auto" w:fill="2F5233"/>
-          </w:tcPr>
-          <w:p>
-            <w:r>
-              <w:rPr>
+          </w:tcPr>
+          <w:p>
+            <w:pPr>
+              <w:spacing w:line="480" w:lineRule="auto"/>
+            </w:pPr>
+            <w:r>
+              <w:rPr>
+                <w:rFonts w:ascii="Times New Roman" w:hAnsi="Times New Roman" w:eastAsia="Times New Roman" w:cs="Times New Roman"/>
                 <w:b/>
                 <w:bCs/>
-                <w:color w:val="FFFFFF"/>
+                <w:color w:val="000000"/>
+                <w:sz w:val="24"/>
+                <w:szCs w:val="24"/>
               </w:rPr>
               <w:t>Classes</w:t>
             </w:r>
@@ -159,14 +190,19 @@
         <w:tc>
           <w:tcPr>
             <w:tcW w:w="2260" w:type="dxa"/>
-            <w:shd w:val="clear" w:color="auto" w:fill="2F5233"/>
-          </w:tcPr>
-          <w:p>
-            <w:r>
-              <w:rPr>
+          </w:tcPr>
+          <w:p>
+            <w:pPr>
+              <w:spacing w:line="480" w:lineRule="auto"/>
+            </w:pPr>
+            <w:r>
+              <w:rPr>
+                <w:rFonts w:ascii="Times New Roman" w:hAnsi="Times New Roman" w:eastAsia="Times New Roman" w:cs="Times New Roman"/>
                 <w:b/>
                 <w:bCs/>
-                <w:color w:val="FFFFFF"/>
+                <w:color w:val="000000"/>
+                <w:sz w:val="24"/>
+                <w:szCs w:val="24"/>
               </w:rPr>
               <w:t>Images</w:t>
             </w:r>
@@ -195,11 +231,17 @@
             <w:tcW w:w="2200" w:type="dxa"/>
           </w:tcPr>
           <w:p>
-            <w:r>
-              <w:rPr>
-                <w:b w:val="0"/>
-                <w:bCs w:val="0"/>
-                <w:color w:val="000000"/>
+            <w:pPr>
+              <w:spacing w:line="480" w:lineRule="auto"/>
+            </w:pPr>
+            <w:r>
+              <w:rPr>
+                <w:rFonts w:ascii="Times New Roman" w:hAnsi="Times New Roman" w:eastAsia="Times New Roman" w:cs="Times New Roman"/>
+                <w:b w:val="0"/>
+                <w:bCs w:val="0"/>
+                <w:color w:val="000000"/>
+                <w:sz w:val="24"/>
+                <w:szCs w:val="24"/>
               </w:rPr>
               <w:t>Cassava</w:t>
             </w:r>
@@ -210,11 +252,17 @@
             <w:tcW w:w="4200" w:type="dxa"/>
           </w:tcPr>
           <w:p>
-            <w:r>
-              <w:rPr>
-                <w:b w:val="0"/>
-                <w:bCs w:val="0"/>
-                <w:color w:val="000000"/>
+            <w:pPr>
+              <w:spacing w:line="480" w:lineRule="auto"/>
+            </w:pPr>
+            <w:r>
+              <w:rPr>
+                <w:rFonts w:ascii="Times New Roman" w:hAnsi="Times New Roman" w:eastAsia="Times New Roman" w:cs="Times New Roman"/>
+                <w:b w:val="0"/>
+                <w:bCs w:val="0"/>
+                <w:color w:val="000000"/>
+                <w:sz w:val="24"/>
+                <w:szCs w:val="24"/>
               </w:rPr>
               <w:t>Kaggle (Cassava Leaf Disease Classification)</w:t>
             </w:r>
@@ -225,11 +273,17 @@
             <w:tcW w:w="1700" w:type="dxa"/>
           </w:tcPr>
           <w:p>
-            <w:r>
-              <w:rPr>
-                <w:b w:val="0"/>
-                <w:bCs w:val="0"/>
-                <w:color w:val="000000"/>
+            <w:pPr>
+              <w:spacing w:line="480" w:lineRule="auto"/>
+            </w:pPr>
+            <w:r>
+              <w:rPr>
+                <w:rFonts w:ascii="Times New Roman" w:hAnsi="Times New Roman" w:eastAsia="Times New Roman" w:cs="Times New Roman"/>
+                <w:b w:val="0"/>
+                <w:bCs w:val="0"/>
+                <w:color w:val="000000"/>
+                <w:sz w:val="24"/>
+                <w:szCs w:val="24"/>
               </w:rPr>
               <w:t>5</w:t>
             </w:r>
@@ -240,11 +294,17 @@
             <w:tcW w:w="2260" w:type="dxa"/>
           </w:tcPr>
           <w:p>
-            <w:r>
-              <w:rPr>
-                <w:b w:val="0"/>
-                <w:bCs w:val="0"/>
-                <w:color w:val="000000"/>
+            <w:pPr>
+              <w:spacing w:line="480" w:lineRule="auto"/>
+            </w:pPr>
+            <w:r>
+              <w:rPr>
+                <w:rFonts w:ascii="Times New Roman" w:hAnsi="Times New Roman" w:eastAsia="Times New Roman" w:cs="Times New Roman"/>
+                <w:b w:val="0"/>
+                <w:bCs w:val="0"/>
+                <w:color w:val="000000"/>
+                <w:sz w:val="24"/>
+                <w:szCs w:val="24"/>
               </w:rPr>
               <w:t>21,397</w:t>
             </w:r>
@@ -273,11 +333,17 @@
             <w:tcW w:w="2200" w:type="dxa"/>
           </w:tcPr>
           <w:p>
-            <w:r>
-              <w:rPr>
-                <w:b w:val="0"/>
-                <w:bCs w:val="0"/>
-                <w:color w:val="000000"/>
+            <w:pPr>
+              <w:spacing w:line="480" w:lineRule="auto"/>
+            </w:pPr>
+            <w:r>
+              <w:rPr>
+                <w:rFonts w:ascii="Times New Roman" w:hAnsi="Times New Roman" w:eastAsia="Times New Roman" w:cs="Times New Roman"/>
+                <w:b w:val="0"/>
+                <w:bCs w:val="0"/>
+                <w:color w:val="000000"/>
+                <w:sz w:val="24"/>
+                <w:szCs w:val="24"/>
               </w:rPr>
               <w:t>Maize</w:t>
             </w:r>
@@ -288,11 +354,17 @@
             <w:tcW w:w="4200" w:type="dxa"/>
           </w:tcPr>
           <w:p>
-            <w:r>
-              <w:rPr>
-                <w:b w:val="0"/>
-                <w:bCs w:val="0"/>
-                <w:color w:val="000000"/>
+            <w:pPr>
+              <w:spacing w:line="480" w:lineRule="auto"/>
+            </w:pPr>
+            <w:r>
+              <w:rPr>
+                <w:rFonts w:ascii="Times New Roman" w:hAnsi="Times New Roman" w:eastAsia="Times New Roman" w:cs="Times New Roman"/>
+                <w:b w:val="0"/>
+                <w:bCs w:val="0"/>
+                <w:color w:val="000000"/>
+                <w:sz w:val="24"/>
+                <w:szCs w:val="24"/>
               </w:rPr>
               <w:t>Kaggle (aggregated multi-source)</w:t>
             </w:r>
@@ -303,11 +375,17 @@
             <w:tcW w:w="1700" w:type="dxa"/>
           </w:tcPr>
           <w:p>
-            <w:r>
-              <w:rPr>
-                <w:b w:val="0"/>
-                <w:bCs w:val="0"/>
-                <w:color w:val="000000"/>
+            <w:pPr>
+              <w:spacing w:line="480" w:lineRule="auto"/>
+            </w:pPr>
+            <w:r>
+              <w:rPr>
+                <w:rFonts w:ascii="Times New Roman" w:hAnsi="Times New Roman" w:eastAsia="Times New Roman" w:cs="Times New Roman"/>
+                <w:b w:val="0"/>
+                <w:bCs w:val="0"/>
+                <w:color w:val="000000"/>
+                <w:sz w:val="24"/>
+                <w:szCs w:val="24"/>
               </w:rPr>
               <w:t>4</w:t>
             </w:r>
@@ -318,11 +396,17 @@
             <w:tcW w:w="2260" w:type="dxa"/>
           </w:tcPr>
           <w:p>
-            <w:r>
-              <w:rPr>
-                <w:b w:val="0"/>
-                <w:bCs w:val="0"/>
-                <w:color w:val="000000"/>
+            <w:pPr>
+              <w:spacing w:line="480" w:lineRule="auto"/>
+            </w:pPr>
+            <w:r>
+              <w:rPr>
+                <w:rFonts w:ascii="Times New Roman" w:hAnsi="Times New Roman" w:eastAsia="Times New Roman" w:cs="Times New Roman"/>
+                <w:b w:val="0"/>
+                <w:bCs w:val="0"/>
+                <w:color w:val="000000"/>
+                <w:sz w:val="24"/>
+                <w:szCs w:val="24"/>
               </w:rPr>
               <w:t>4,188</w:t>
             </w:r>
@@ -351,11 +435,17 @@
             <w:tcW w:w="2200" w:type="dxa"/>
           </w:tcPr>
           <w:p>
-            <w:r>
-              <w:rPr>
-                <w:b w:val="0"/>
-                <w:bCs w:val="0"/>
-                <w:color w:val="000000"/>
+            <w:pPr>
+              <w:spacing w:line="480" w:lineRule="auto"/>
+            </w:pPr>
+            <w:r>
+              <w:rPr>
+                <w:rFonts w:ascii="Times New Roman" w:hAnsi="Times New Roman" w:eastAsia="Times New Roman" w:cs="Times New Roman"/>
+                <w:b w:val="0"/>
+                <w:bCs w:val="0"/>
+                <w:color w:val="000000"/>
+                <w:sz w:val="24"/>
+                <w:szCs w:val="24"/>
               </w:rPr>
               <w:t>Taro</w:t>
             </w:r>
@@ -366,11 +456,17 @@
             <w:tcW w:w="4200" w:type="dxa"/>
           </w:tcPr>
           <w:p>
-            <w:r>
-              <w:rPr>
-                <w:b w:val="0"/>
-                <w:bCs w:val="0"/>
-                <w:color w:val="000000"/>
+            <w:pPr>
+              <w:spacing w:line="480" w:lineRule="auto"/>
+            </w:pPr>
+            <w:r>
+              <w:rPr>
+                <w:rFonts w:ascii="Times New Roman" w:hAnsi="Times New Roman" w:eastAsia="Times New Roman" w:cs="Times New Roman"/>
+                <w:b w:val="0"/>
+                <w:bCs w:val="0"/>
+                <w:color w:val="000000"/>
+                <w:sz w:val="24"/>
+                <w:szCs w:val="24"/>
               </w:rPr>
               <w:t>Mendeley Data (West African-collected; substituted for Yam)</w:t>
             </w:r>
@@ -381,11 +477,17 @@
             <w:tcW w:w="1700" w:type="dxa"/>
           </w:tcPr>
           <w:p>
-            <w:r>
-              <w:rPr>
-                <w:b w:val="0"/>
-                <w:bCs w:val="0"/>
-                <w:color w:val="000000"/>
+            <w:pPr>
+              <w:spacing w:line="480" w:lineRule="auto"/>
+            </w:pPr>
+            <w:r>
+              <w:rPr>
+                <w:rFonts w:ascii="Times New Roman" w:hAnsi="Times New Roman" w:eastAsia="Times New Roman" w:cs="Times New Roman"/>
+                <w:b w:val="0"/>
+                <w:bCs w:val="0"/>
+                <w:color w:val="000000"/>
+                <w:sz w:val="24"/>
+                <w:szCs w:val="24"/>
               </w:rPr>
               <w:t>5</w:t>
             </w:r>
@@ -396,11 +498,17 @@
             <w:tcW w:w="2260" w:type="dxa"/>
           </w:tcPr>
           <w:p>
-            <w:r>
-              <w:rPr>
-                <w:b w:val="0"/>
-                <w:bCs w:val="0"/>
-                <w:color w:val="000000"/>
+            <w:pPr>
+              <w:spacing w:line="480" w:lineRule="auto"/>
+            </w:pPr>
+            <w:r>
+              <w:rPr>
+                <w:rFonts w:ascii="Times New Roman" w:hAnsi="Times New Roman" w:eastAsia="Times New Roman" w:cs="Times New Roman"/>
+                <w:b w:val="0"/>
+                <w:bCs w:val="0"/>
+                <w:color w:val="000000"/>
+                <w:sz w:val="24"/>
+                <w:szCs w:val="24"/>
               </w:rPr>
               <w:t>21,220</w:t>
             </w:r>
@@ -429,11 +537,17 @@
             <w:tcW w:w="2200" w:type="dxa"/>
           </w:tcPr>
           <w:p>
-            <w:r>
-              <w:rPr>
-                <w:b w:val="0"/>
-                <w:bCs w:val="0"/>
-                <w:color w:val="000000"/>
+            <w:pPr>
+              <w:spacing w:line="480" w:lineRule="auto"/>
+            </w:pPr>
+            <w:r>
+              <w:rPr>
+                <w:rFonts w:ascii="Times New Roman" w:hAnsi="Times New Roman" w:eastAsia="Times New Roman" w:cs="Times New Roman"/>
+                <w:b w:val="0"/>
+                <w:bCs w:val="0"/>
+                <w:color w:val="000000"/>
+                <w:sz w:val="24"/>
+                <w:szCs w:val="24"/>
               </w:rPr>
               <w:t>Tomato</w:t>
             </w:r>
@@ -444,11 +558,17 @@
             <w:tcW w:w="4200" w:type="dxa"/>
           </w:tcPr>
           <w:p>
-            <w:r>
-              <w:rPr>
-                <w:b w:val="0"/>
-                <w:bCs w:val="0"/>
-                <w:color w:val="000000"/>
+            <w:pPr>
+              <w:spacing w:line="480" w:lineRule="auto"/>
+            </w:pPr>
+            <w:r>
+              <w:rPr>
+                <w:rFonts w:ascii="Times New Roman" w:hAnsi="Times New Roman" w:eastAsia="Times New Roman" w:cs="Times New Roman"/>
+                <w:b w:val="0"/>
+                <w:bCs w:val="0"/>
+                <w:color w:val="000000"/>
+                <w:sz w:val="24"/>
+                <w:szCs w:val="24"/>
               </w:rPr>
               <w:t>PlantVillage (Kaggle)</w:t>
             </w:r>
@@ -459,11 +579,17 @@
             <w:tcW w:w="1700" w:type="dxa"/>
           </w:tcPr>
           <w:p>
-            <w:r>
-              <w:rPr>
-                <w:b w:val="0"/>
-                <w:bCs w:val="0"/>
-                <w:color w:val="000000"/>
+            <w:pPr>
+              <w:spacing w:line="480" w:lineRule="auto"/>
+            </w:pPr>
+            <w:r>
+              <w:rPr>
+                <w:rFonts w:ascii="Times New Roman" w:hAnsi="Times New Roman" w:eastAsia="Times New Roman" w:cs="Times New Roman"/>
+                <w:b w:val="0"/>
+                <w:bCs w:val="0"/>
+                <w:color w:val="000000"/>
+                <w:sz w:val="24"/>
+                <w:szCs w:val="24"/>
               </w:rPr>
               <w:t>10</w:t>
             </w:r>
@@ -474,11 +600,17 @@
             <w:tcW w:w="2260" w:type="dxa"/>
           </w:tcPr>
           <w:p>
-            <w:r>
-              <w:rPr>
-                <w:b w:val="0"/>
-                <w:bCs w:val="0"/>
-                <w:color w:val="000000"/>
+            <w:pPr>
+              <w:spacing w:line="480" w:lineRule="auto"/>
+            </w:pPr>
+            <w:r>
+              <w:rPr>
+                <w:rFonts w:ascii="Times New Roman" w:hAnsi="Times New Roman" w:eastAsia="Times New Roman" w:cs="Times New Roman"/>
+                <w:b w:val="0"/>
+                <w:bCs w:val="0"/>
+                <w:color w:val="000000"/>
+                <w:sz w:val="24"/>
+                <w:szCs w:val="24"/>
               </w:rPr>
               <w:t>16,011</w:t>
             </w:r>
@@ -507,11 +639,17 @@
             <w:tcW w:w="2200" w:type="dxa"/>
           </w:tcPr>
           <w:p>
-            <w:r>
-              <w:rPr>
-                <w:b w:val="0"/>
-                <w:bCs w:val="0"/>
-                <w:color w:val="000000"/>
+            <w:pPr>
+              <w:spacing w:line="480" w:lineRule="auto"/>
+            </w:pPr>
+            <w:r>
+              <w:rPr>
+                <w:rFonts w:ascii="Times New Roman" w:hAnsi="Times New Roman" w:eastAsia="Times New Roman" w:cs="Times New Roman"/>
+                <w:b w:val="0"/>
+                <w:bCs w:val="0"/>
+                <w:color w:val="000000"/>
+                <w:sz w:val="24"/>
+                <w:szCs w:val="24"/>
               </w:rPr>
               <w:t>Pepper</w:t>
             </w:r>
@@ -522,11 +660,17 @@
             <w:tcW w:w="4200" w:type="dxa"/>
           </w:tcPr>
           <w:p>
-            <w:r>
-              <w:rPr>
-                <w:b w:val="0"/>
-                <w:bCs w:val="0"/>
-                <w:color w:val="000000"/>
+            <w:pPr>
+              <w:spacing w:line="480" w:lineRule="auto"/>
+            </w:pPr>
+            <w:r>
+              <w:rPr>
+                <w:rFonts w:ascii="Times New Roman" w:hAnsi="Times New Roman" w:eastAsia="Times New Roman" w:cs="Times New Roman"/>
+                <w:b w:val="0"/>
+                <w:bCs w:val="0"/>
+                <w:color w:val="000000"/>
+                <w:sz w:val="24"/>
+                <w:szCs w:val="24"/>
               </w:rPr>
               <w:t>PlantVillage (Kaggle)</w:t>
             </w:r>
@@ -537,11 +681,17 @@
             <w:tcW w:w="1700" w:type="dxa"/>
           </w:tcPr>
           <w:p>
-            <w:r>
-              <w:rPr>
-                <w:b w:val="0"/>
-                <w:bCs w:val="0"/>
-                <w:color w:val="000000"/>
+            <w:pPr>
+              <w:spacing w:line="480" w:lineRule="auto"/>
+            </w:pPr>
+            <w:r>
+              <w:rPr>
+                <w:rFonts w:ascii="Times New Roman" w:hAnsi="Times New Roman" w:eastAsia="Times New Roman" w:cs="Times New Roman"/>
+                <w:b w:val="0"/>
+                <w:bCs w:val="0"/>
+                <w:color w:val="000000"/>
+                <w:sz w:val="24"/>
+                <w:szCs w:val="24"/>
               </w:rPr>
               <w:t>2</w:t>
             </w:r>
@@ -552,11 +702,17 @@
             <w:tcW w:w="2260" w:type="dxa"/>
           </w:tcPr>
           <w:p>
-            <w:r>
-              <w:rPr>
-                <w:b w:val="0"/>
-                <w:bCs w:val="0"/>
-                <w:color w:val="000000"/>
+            <w:pPr>
+              <w:spacing w:line="480" w:lineRule="auto"/>
+            </w:pPr>
+            <w:r>
+              <w:rPr>
+                <w:rFonts w:ascii="Times New Roman" w:hAnsi="Times New Roman" w:eastAsia="Times New Roman" w:cs="Times New Roman"/>
+                <w:b w:val="0"/>
+                <w:bCs w:val="0"/>
+                <w:color w:val="000000"/>
+                <w:sz w:val="24"/>
+                <w:szCs w:val="24"/>
               </w:rPr>
               <w:t>2,475</w:t>
             </w:r>
@@ -585,11 +741,17 @@
             <w:tcW w:w="2200" w:type="dxa"/>
           </w:tcPr>
           <w:p>
-            <w:r>
-              <w:rPr>
-                <w:b w:val="0"/>
-                <w:bCs w:val="0"/>
-                <w:color w:val="000000"/>
+            <w:pPr>
+              <w:spacing w:line="480" w:lineRule="auto"/>
+            </w:pPr>
+            <w:r>
+              <w:rPr>
+                <w:rFonts w:ascii="Times New Roman" w:hAnsi="Times New Roman" w:eastAsia="Times New Roman" w:cs="Times New Roman"/>
+                <w:b w:val="0"/>
+                <w:bCs w:val="0"/>
+                <w:color w:val="000000"/>
+                <w:sz w:val="24"/>
+                <w:szCs w:val="24"/>
               </w:rPr>
               <w:t>Potato</w:t>
             </w:r>
@@ -600,11 +762,17 @@
             <w:tcW w:w="4200" w:type="dxa"/>
           </w:tcPr>
           <w:p>
-            <w:r>
-              <w:rPr>
-                <w:b w:val="0"/>
-                <w:bCs w:val="0"/>
-                <w:color w:val="000000"/>
+            <w:pPr>
+              <w:spacing w:line="480" w:lineRule="auto"/>
+            </w:pPr>
+            <w:r>
+              <w:rPr>
+                <w:rFonts w:ascii="Times New Roman" w:hAnsi="Times New Roman" w:eastAsia="Times New Roman" w:cs="Times New Roman"/>
+                <w:b w:val="0"/>
+                <w:bCs w:val="0"/>
+                <w:color w:val="000000"/>
+                <w:sz w:val="24"/>
+                <w:szCs w:val="24"/>
               </w:rPr>
               <w:t>PlantVillage (Kaggle)</w:t>
             </w:r>
@@ -615,11 +783,17 @@
             <w:tcW w:w="1700" w:type="dxa"/>
           </w:tcPr>
           <w:p>
-            <w:r>
-              <w:rPr>
-                <w:b w:val="0"/>
-                <w:bCs w:val="0"/>
-                <w:color w:val="000000"/>
+            <w:pPr>
+              <w:spacing w:line="480" w:lineRule="auto"/>
+            </w:pPr>
+            <w:r>
+              <w:rPr>
+                <w:rFonts w:ascii="Times New Roman" w:hAnsi="Times New Roman" w:eastAsia="Times New Roman" w:cs="Times New Roman"/>
+                <w:b w:val="0"/>
+                <w:bCs w:val="0"/>
+                <w:color w:val="000000"/>
+                <w:sz w:val="24"/>
+                <w:szCs w:val="24"/>
               </w:rPr>
               <w:t>3</w:t>
             </w:r>
@@ -630,11 +804,17 @@
             <w:tcW w:w="2260" w:type="dxa"/>
           </w:tcPr>
           <w:p>
-            <w:r>
-              <w:rPr>
-                <w:b w:val="0"/>
-                <w:bCs w:val="0"/>
-                <w:color w:val="000000"/>
+            <w:pPr>
+              <w:spacing w:line="480" w:lineRule="auto"/>
+            </w:pPr>
+            <w:r>
+              <w:rPr>
+                <w:rFonts w:ascii="Times New Roman" w:hAnsi="Times New Roman" w:eastAsia="Times New Roman" w:cs="Times New Roman"/>
+                <w:b w:val="0"/>
+                <w:bCs w:val="0"/>
+                <w:color w:val="000000"/>
+                <w:sz w:val="24"/>
+                <w:szCs w:val="24"/>
               </w:rPr>
               <w:t>2,152</w:t>
             </w:r>
@@ -661,14 +841,19 @@
         <w:tc>
           <w:tcPr>
             <w:tcW w:w="2200" w:type="dxa"/>
-            <w:shd w:val="clear" w:color="auto" w:fill="2F5233"/>
-          </w:tcPr>
-          <w:p>
-            <w:r>
-              <w:rPr>
+          </w:tcPr>
+          <w:p>
+            <w:pPr>
+              <w:spacing w:line="480" w:lineRule="auto"/>
+            </w:pPr>
+            <w:r>
+              <w:rPr>
+                <w:rFonts w:ascii="Times New Roman" w:hAnsi="Times New Roman" w:eastAsia="Times New Roman" w:cs="Times New Roman"/>
                 <w:b/>
                 <w:bCs/>
-                <w:color w:val="FFFFFF"/>
+                <w:color w:val="000000"/>
+                <w:sz w:val="24"/>
+                <w:szCs w:val="24"/>
               </w:rPr>
               <w:t>Total</w:t>
             </w:r>
@@ -677,21 +862,29 @@
         <w:tc>
           <w:tcPr>
             <w:tcW w:w="4200" w:type="dxa"/>
-            <w:shd w:val="clear" w:color="auto" w:fill="2F5233"/>
-          </w:tcPr>
-          <w:p/>
+          </w:tcPr>
+          <w:p>
+            <w:pPr>
+              <w:spacing w:line="480" w:lineRule="auto"/>
+            </w:pPr>
+          </w:p>
         </w:tc>
         <w:tc>
           <w:tcPr>
             <w:tcW w:w="1700" w:type="dxa"/>
-            <w:shd w:val="clear" w:color="auto" w:fill="2F5233"/>
-          </w:tcPr>
-          <w:p>
-            <w:r>
-              <w:rPr>
+          </w:tcPr>
+          <w:p>
+            <w:pPr>
+              <w:spacing w:line="480" w:lineRule="auto"/>
+            </w:pPr>
+            <w:r>
+              <w:rPr>
+                <w:rFonts w:ascii="Times New Roman" w:hAnsi="Times New Roman" w:eastAsia="Times New Roman" w:cs="Times New Roman"/>
                 <w:b/>
                 <w:bCs/>
-                <w:color w:val="FFFFFF"/>
+                <w:color w:val="000000"/>
+                <w:sz w:val="24"/>
+                <w:szCs w:val="24"/>
               </w:rPr>
               <w:t>29</w:t>
             </w:r>
@@ -700,14 +893,19 @@
         <w:tc>
           <w:tcPr>
             <w:tcW w:w="2260" w:type="dxa"/>
-            <w:shd w:val="clear" w:color="auto" w:fill="2F5233"/>
-          </w:tcPr>
-          <w:p>
-            <w:r>
-              <w:rPr>
+          </w:tcPr>
+          <w:p>
+            <w:pPr>
+              <w:spacing w:line="480" w:lineRule="auto"/>
+            </w:pPr>
+            <w:r>
+              <w:rPr>
+                <w:rFonts w:ascii="Times New Roman" w:hAnsi="Times New Roman" w:eastAsia="Times New Roman" w:cs="Times New Roman"/>
                 <w:b/>
                 <w:bCs/>
-                <w:color w:val="FFFFFF"/>
+                <w:color w:val="000000"/>
+                <w:sz w:val="24"/>
+                <w:szCs w:val="24"/>
               </w:rPr>
               <w:t>67,443</w:t>
             </w:r>
@@ -717,16 +915,17 @@
     </w:tbl>
     <w:p>
       <w:pPr>
-        <w:spacing w:after="300"/>
+        <w:spacing w:after="300" w:line="480" w:lineRule="auto"/>
         <w:jc w:val="center"/>
       </w:pPr>
       <w:r>
         <w:rPr>
+          <w:rFonts w:ascii="Times New Roman" w:hAnsi="Times New Roman" w:eastAsia="Times New Roman" w:cs="Times New Roman"/>
           <w:i/>
           <w:iCs/>
-          <w:color w:val="555555"/>
-          <w:sz w:val="20"/>
-          <w:szCs w:val="20"/>
+          <w:color w:val="000000"/>
+          <w:sz w:val="24"/>
+          <w:szCs w:val="24"/>
         </w:rPr>
         <w:t>Table 1. Summary of acquired datasets by crop, source, class count, and image volume.</w:t>
       </w:r>
@@ -734,60 +933,102 @@
     <w:p>
       <w:pPr>
         <w:pStyle w:val="3"/>
-        <w:spacing w:before="240" w:after="120"/>
-      </w:pPr>
-      <w:r>
+        <w:spacing w:before="240" w:after="120" w:line="480" w:lineRule="auto"/>
+      </w:pPr>
+      <w:r>
+        <w:rPr>
+          <w:rFonts w:ascii="Times New Roman" w:hAnsi="Times New Roman" w:eastAsia="Times New Roman" w:cs="Times New Roman"/>
+          <w:color w:val="000000"/>
+          <w:sz w:val="28"/>
+          <w:szCs w:val="28"/>
+        </w:rPr>
         <w:t>1.1 Note on Yam Substitution</w:t>
       </w:r>
     </w:p>
     <w:p>
       <w:pPr>
-        <w:spacing w:after="160"/>
-      </w:pPr>
-      <w:r>
+        <w:spacing w:after="160" w:line="480" w:lineRule="auto"/>
+      </w:pPr>
+      <w:r>
+        <w:rPr>
+          <w:rFonts w:ascii="Times New Roman" w:hAnsi="Times New Roman" w:eastAsia="Times New Roman" w:cs="Times New Roman"/>
+          <w:color w:val="000000"/>
+          <w:sz w:val="24"/>
+          <w:szCs w:val="24"/>
+        </w:rPr>
         <w:t>No publicly available, sufficiently large yam (Dioscorea spp.) leaf disease dataset was identified during the literature and data-sourcing search. Taro (cocoyam) was substituted as it is a comparable West African root/tuber staple, with a recent (2025), regionally-collected, and well-documented public dataset available via Mendeley Data. This substitution is itself a documented finding regarding the current data-availability gap for yam-specific disease research in the region, and is discussed further in the Limitations section of this paper.</w:t>
       </w:r>
     </w:p>
     <w:p>
       <w:pPr>
         <w:pStyle w:val="2"/>
-        <w:spacing w:before="300" w:after="150"/>
-      </w:pPr>
-      <w:r>
+        <w:spacing w:before="300" w:after="150" w:line="480" w:lineRule="auto"/>
+      </w:pPr>
+      <w:r>
+        <w:rPr>
+          <w:rFonts w:ascii="Times New Roman" w:hAnsi="Times New Roman" w:eastAsia="Times New Roman" w:cs="Times New Roman"/>
+          <w:color w:val="000000"/>
+          <w:sz w:val="28"/>
+          <w:szCs w:val="28"/>
+        </w:rPr>
         <w:t>2. Data Validation</w:t>
       </w:r>
     </w:p>
     <w:p>
       <w:pPr>
-        <w:spacing w:after="160"/>
-      </w:pPr>
-      <w:r>
-        <w:t>All 67,443 acquired images were programmatically verified for file integrity using Python's PIL library (Image.verify()). One corrupted, non-image artifact file (filename: svn-r6Yb5c, likely a packaging remnant from the source repository) was identified within the Tomato_YellowLeaf_Curl_Virus class and removed. The final validated dataset comprises 67,442 images across 29 classes.</w:t>
+        <w:spacing w:after="160" w:line="480" w:lineRule="auto"/>
+      </w:pPr>
+      <w:r>
+        <w:rPr>
+          <w:rFonts w:ascii="Times New Roman" w:hAnsi="Times New Roman" w:eastAsia="Times New Roman" w:cs="Times New Roman"/>
+          <w:color w:val="000000"/>
+          <w:sz w:val="24"/>
+          <w:szCs w:val="24"/>
+        </w:rPr>
+        <w:t>The notebook identified one corrupted, non-image artifact in the Tomato_YellowLeaf_Curl_Virus folder and removed it before constructing the final manifest. The cleaned manifest contains 67,443 valid images across 29 classes.</w:t>
       </w:r>
     </w:p>
     <w:p>
       <w:pPr>
         <w:pStyle w:val="2"/>
-        <w:spacing w:before="300" w:after="150"/>
-      </w:pPr>
-      <w:r>
+        <w:spacing w:before="300" w:after="150" w:line="480" w:lineRule="auto"/>
+      </w:pPr>
+      <w:r>
+        <w:rPr>
+          <w:rFonts w:ascii="Times New Roman" w:hAnsi="Times New Roman" w:eastAsia="Times New Roman" w:cs="Times New Roman"/>
+          <w:color w:val="000000"/>
+          <w:sz w:val="28"/>
+          <w:szCs w:val="28"/>
+        </w:rPr>
         <w:t>3. Class Distribution</w:t>
       </w:r>
     </w:p>
     <w:p>
       <w:pPr>
-        <w:spacing w:after="160"/>
-      </w:pPr>
-      <w:r>
+        <w:spacing w:after="160" w:line="480" w:lineRule="auto"/>
+      </w:pPr>
+      <w:r>
+        <w:rPr>
+          <w:rFonts w:ascii="Times New Roman" w:hAnsi="Times New Roman" w:eastAsia="Times New Roman" w:cs="Times New Roman"/>
+          <w:color w:val="000000"/>
+          <w:sz w:val="24"/>
+          <w:szCs w:val="24"/>
+        </w:rPr>
         <w:t>Figure 1 presents the class distribution for each of the six crops. Distribution reveals substantial imbalance both between crops and within individual crops.</w:t>
       </w:r>
     </w:p>
     <w:p>
       <w:pPr>
-        <w:spacing w:before="200" w:after="100"/>
+        <w:spacing w:before="200" w:after="100" w:line="480" w:lineRule="auto"/>
         <w:jc w:val="center"/>
       </w:pPr>
       <w:r>
+        <w:rPr>
+          <w:rFonts w:ascii="Times New Roman" w:hAnsi="Times New Roman" w:eastAsia="Times New Roman" w:cs="Times New Roman"/>
+          <w:color w:val="000000"/>
+          <w:sz w:val="24"/>
+          <w:szCs w:val="24"/>
+        </w:rPr>
         <w:drawing>
           <wp:inline distT="0" distB="0" distL="0" distR="0">
             <wp:extent cx="5943600" cy="3286125"/>
@@ -830,28 +1071,33 @@
     </w:p>
     <w:p>
       <w:pPr>
-        <w:spacing w:after="300"/>
+        <w:spacing w:after="300" w:line="480" w:lineRule="auto"/>
         <w:jc w:val="center"/>
       </w:pPr>
       <w:r>
         <w:rPr>
+          <w:rFonts w:ascii="Times New Roman" w:hAnsi="Times New Roman" w:eastAsia="Times New Roman" w:cs="Times New Roman"/>
           <w:i/>
           <w:iCs/>
-          <w:color w:val="555555"/>
-          <w:sz w:val="20"/>
-          <w:szCs w:val="20"/>
+          <w:color w:val="000000"/>
+          <w:sz w:val="24"/>
+          <w:szCs w:val="24"/>
         </w:rPr>
         <w:t>Figure 1. Class distribution across all six crops (Maize, Taro, Tomato, Pepper, Potato, Cassava).</w:t>
       </w:r>
     </w:p>
     <w:p>
       <w:pPr>
-        <w:spacing w:before="100" w:after="80"/>
-      </w:pPr>
-      <w:r>
-        <w:rPr>
+        <w:spacing w:before="100" w:after="80" w:line="480" w:lineRule="auto"/>
+      </w:pPr>
+      <w:r>
+        <w:rPr>
+          <w:rFonts w:ascii="Times New Roman" w:hAnsi="Times New Roman" w:eastAsia="Times New Roman" w:cs="Times New Roman"/>
           <w:b/>
           <w:bCs/>
+          <w:color w:val="000000"/>
+          <w:sz w:val="24"/>
+          <w:szCs w:val="24"/>
         </w:rPr>
         <w:t>Key observations:</w:t>
       </w:r>
@@ -863,9 +1109,15 @@
           <w:ilvl w:val="0"/>
           <w:numId w:val="1"/>
         </w:numPr>
-        <w:spacing w:after="80"/>
-      </w:pPr>
-      <w:r>
+        <w:spacing w:after="80" w:line="480" w:lineRule="auto"/>
+      </w:pPr>
+      <w:r>
+        <w:rPr>
+          <w:rFonts w:ascii="Times New Roman" w:hAnsi="Times New Roman" w:eastAsia="Times New Roman" w:cs="Times New Roman"/>
+          <w:color w:val="000000"/>
+          <w:sz w:val="24"/>
+          <w:szCs w:val="24"/>
+        </w:rPr>
         <w:t>Between-crop imbalance: Cassava, Taro, and Tomato each contribute 16,000–21,000+ images, while Pepper and Potato contribute only ~2,000–2,500 images each.</w:t>
       </w:r>
     </w:p>
@@ -876,9 +1128,15 @@
           <w:ilvl w:val="0"/>
           <w:numId w:val="1"/>
         </w:numPr>
-        <w:spacing w:after="80"/>
-      </w:pPr>
-      <w:r>
+        <w:spacing w:after="80" w:line="480" w:lineRule="auto"/>
+      </w:pPr>
+      <w:r>
+        <w:rPr>
+          <w:rFonts w:ascii="Times New Roman" w:hAnsi="Times New Roman" w:eastAsia="Times New Roman" w:cs="Times New Roman"/>
+          <w:color w:val="000000"/>
+          <w:sz w:val="24"/>
+          <w:szCs w:val="24"/>
+        </w:rPr>
         <w:t>Within-crop imbalance (Cassava): Cassava_Mosaic_Disease (13,158 images) vastly outweighs Cassava_Bacterial_Blight (1,087 images), a ratio of roughly 12:1.</w:t>
       </w:r>
     </w:p>
@@ -889,9 +1147,15 @@
           <w:ilvl w:val="0"/>
           <w:numId w:val="1"/>
         </w:numPr>
-        <w:spacing w:after="80"/>
-      </w:pPr>
-      <w:r>
+        <w:spacing w:after="80" w:line="480" w:lineRule="auto"/>
+      </w:pPr>
+      <w:r>
+        <w:rPr>
+          <w:rFonts w:ascii="Times New Roman" w:hAnsi="Times New Roman" w:eastAsia="Times New Roman" w:cs="Times New Roman"/>
+          <w:color w:val="000000"/>
+          <w:sz w:val="24"/>
+          <w:szCs w:val="24"/>
+        </w:rPr>
         <w:t>Within-crop imbalance (Potato): Potato___healthy (152 images) is dramatically underrepresented relative to its two disease classes (~1,000 images each).</w:t>
       </w:r>
     </w:p>
@@ -902,9 +1166,15 @@
           <w:ilvl w:val="0"/>
           <w:numId w:val="1"/>
         </w:numPr>
-        <w:spacing w:after="80"/>
-      </w:pPr>
-      <w:r>
+        <w:spacing w:after="80" w:line="480" w:lineRule="auto"/>
+      </w:pPr>
+      <w:r>
+        <w:rPr>
+          <w:rFonts w:ascii="Times New Roman" w:hAnsi="Times New Roman" w:eastAsia="Times New Roman" w:cs="Times New Roman"/>
+          <w:color w:val="000000"/>
+          <w:sz w:val="24"/>
+          <w:szCs w:val="24"/>
+        </w:rPr>
         <w:t>Within-crop imbalance (Taro): Taro_Healthy (8,744 images) is disproportionately high relative to its four disease-stage classes.</w:t>
       </w:r>
     </w:p>
@@ -915,35 +1185,59 @@
           <w:ilvl w:val="0"/>
           <w:numId w:val="1"/>
         </w:numPr>
-        <w:spacing w:after="80"/>
-      </w:pPr>
-      <w:r>
+        <w:spacing w:after="80" w:line="480" w:lineRule="auto"/>
+      </w:pPr>
+      <w:r>
+        <w:rPr>
+          <w:rFonts w:ascii="Times New Roman" w:hAnsi="Times New Roman" w:eastAsia="Times New Roman" w:cs="Times New Roman"/>
+          <w:color w:val="000000"/>
+          <w:sz w:val="24"/>
+          <w:szCs w:val="24"/>
+        </w:rPr>
         <w:t>This imbalance will be addressed during preprocessing via class weighting in the loss function and/or targeted augmentation of minority classes.</w:t>
       </w:r>
     </w:p>
     <w:p>
       <w:pPr>
         <w:pStyle w:val="2"/>
-        <w:spacing w:before="300" w:after="150"/>
-      </w:pPr>
-      <w:r>
+        <w:spacing w:before="300" w:after="150" w:line="480" w:lineRule="auto"/>
+      </w:pPr>
+      <w:r>
+        <w:rPr>
+          <w:rFonts w:ascii="Times New Roman" w:hAnsi="Times New Roman" w:eastAsia="Times New Roman" w:cs="Times New Roman"/>
+          <w:color w:val="000000"/>
+          <w:sz w:val="28"/>
+          <w:szCs w:val="28"/>
+        </w:rPr>
         <w:t>4. Sample Verification</w:t>
       </w:r>
     </w:p>
     <w:p>
       <w:pPr>
-        <w:spacing w:after="160"/>
-      </w:pPr>
-      <w:r>
+        <w:spacing w:after="160" w:line="480" w:lineRule="auto"/>
+      </w:pPr>
+      <w:r>
+        <w:rPr>
+          <w:rFonts w:ascii="Times New Roman" w:hAnsi="Times New Roman" w:eastAsia="Times New Roman" w:cs="Times New Roman"/>
+          <w:color w:val="000000"/>
+          <w:sz w:val="24"/>
+          <w:szCs w:val="24"/>
+        </w:rPr>
         <w:t>A representative sample image was drawn from each of the 29 classes to visually confirm correct labeling and inspect image characteristics (Figure 2).</w:t>
       </w:r>
     </w:p>
     <w:p>
       <w:pPr>
-        <w:spacing w:before="200" w:after="100"/>
+        <w:spacing w:before="200" w:after="100" w:line="480" w:lineRule="auto"/>
         <w:jc w:val="center"/>
       </w:pPr>
       <w:r>
+        <w:rPr>
+          <w:rFonts w:ascii="Times New Roman" w:hAnsi="Times New Roman" w:eastAsia="Times New Roman" w:cs="Times New Roman"/>
+          <w:color w:val="000000"/>
+          <w:sz w:val="24"/>
+          <w:szCs w:val="24"/>
+        </w:rPr>
         <w:drawing>
           <wp:inline distT="0" distB="0" distL="0" distR="0">
             <wp:extent cx="5943600" cy="4448175"/>
@@ -986,42 +1280,61 @@
     </w:p>
     <w:p>
       <w:pPr>
-        <w:spacing w:after="300"/>
+        <w:spacing w:after="300" w:line="480" w:lineRule="auto"/>
         <w:jc w:val="center"/>
       </w:pPr>
       <w:r>
         <w:rPr>
+          <w:rFonts w:ascii="Times New Roman" w:hAnsi="Times New Roman" w:eastAsia="Times New Roman" w:cs="Times New Roman"/>
           <w:i/>
           <w:iCs/>
-          <w:color w:val="555555"/>
-          <w:sz w:val="20"/>
-          <w:szCs w:val="20"/>
+          <w:color w:val="000000"/>
+          <w:sz w:val="24"/>
+          <w:szCs w:val="24"/>
         </w:rPr>
         <w:t>Figure 2. Representative sample image from each of the 29 disease/health classes across all six crops.</w:t>
       </w:r>
     </w:p>
     <w:p>
       <w:pPr>
-        <w:spacing w:after="160"/>
-      </w:pPr>
-      <w:r>
+        <w:spacing w:after="160" w:line="480" w:lineRule="auto"/>
+      </w:pPr>
+      <w:r>
+        <w:rPr>
+          <w:rFonts w:ascii="Times New Roman" w:hAnsi="Times New Roman" w:eastAsia="Times New Roman" w:cs="Times New Roman"/>
+          <w:color w:val="000000"/>
+          <w:sz w:val="24"/>
+          <w:szCs w:val="24"/>
+        </w:rPr>
         <w:t>Visual inspection confirmed correct labeling across all classes. Notably, the three PlantVillage-sourced crops (Tomato, Pepper, Potato) share a consistent grey lab-background aesthetic, while Taro and Cassava consist of natural field photographs with varied backgrounds (soil, foliage, and in some cases a hand holding the leaf). This domain-shift between lab-controlled and field-collected imagery is flagged as a methodological consideration for the Discussion and Limitations sections, as a model trained on this combined set may partially learn background-associated features rather than purely disease-relevant features.</w:t>
       </w:r>
     </w:p>
     <w:p>
       <w:pPr>
         <w:pStyle w:val="2"/>
-        <w:spacing w:before="300" w:after="150"/>
-      </w:pPr>
-      <w:r>
+        <w:spacing w:before="300" w:after="150" w:line="480" w:lineRule="auto"/>
+      </w:pPr>
+      <w:r>
+        <w:rPr>
+          <w:rFonts w:ascii="Times New Roman" w:hAnsi="Times New Roman" w:eastAsia="Times New Roman" w:cs="Times New Roman"/>
+          <w:color w:val="000000"/>
+          <w:sz w:val="28"/>
+          <w:szCs w:val="28"/>
+        </w:rPr>
         <w:t>5. Image Resolution Audit</w:t>
       </w:r>
     </w:p>
     <w:p>
       <w:pPr>
-        <w:spacing w:after="160"/>
-      </w:pPr>
-      <w:r>
+        <w:spacing w:after="160" w:line="480" w:lineRule="auto"/>
+      </w:pPr>
+      <w:r>
+        <w:rPr>
+          <w:rFonts w:ascii="Times New Roman" w:hAnsi="Times New Roman" w:eastAsia="Times New Roman" w:cs="Times New Roman"/>
+          <w:color w:val="000000"/>
+          <w:sz w:val="24"/>
+          <w:szCs w:val="24"/>
+        </w:rPr>
         <w:t>Image dimensions were sampled and audited across all six crops to inform the preprocessing pipeline (Table 2).</w:t>
       </w:r>
     </w:p>
@@ -1070,14 +1383,19 @@
         <w:tc>
           <w:tcPr>
             <w:tcW w:w="5180" w:type="dxa"/>
-            <w:shd w:val="clear" w:color="auto" w:fill="2F5233"/>
-          </w:tcPr>
-          <w:p>
-            <w:r>
-              <w:rPr>
+          </w:tcPr>
+          <w:p>
+            <w:pPr>
+              <w:spacing w:line="480" w:lineRule="auto"/>
+            </w:pPr>
+            <w:r>
+              <w:rPr>
+                <w:rFonts w:ascii="Times New Roman" w:hAnsi="Times New Roman" w:eastAsia="Times New Roman" w:cs="Times New Roman"/>
                 <w:b/>
                 <w:bCs/>
-                <w:color w:val="FFFFFF"/>
+                <w:color w:val="000000"/>
+                <w:sz w:val="24"/>
+                <w:szCs w:val="24"/>
               </w:rPr>
               <w:t>Source</w:t>
             </w:r>
@@ -1086,14 +1404,19 @@
         <w:tc>
           <w:tcPr>
             <w:tcW w:w="5180" w:type="dxa"/>
-            <w:shd w:val="clear" w:color="auto" w:fill="2F5233"/>
-          </w:tcPr>
-          <w:p>
-            <w:r>
-              <w:rPr>
+          </w:tcPr>
+          <w:p>
+            <w:pPr>
+              <w:spacing w:line="480" w:lineRule="auto"/>
+            </w:pPr>
+            <w:r>
+              <w:rPr>
+                <w:rFonts w:ascii="Times New Roman" w:hAnsi="Times New Roman" w:eastAsia="Times New Roman" w:cs="Times New Roman"/>
                 <w:b/>
                 <w:bCs/>
-                <w:color w:val="FFFFFF"/>
+                <w:color w:val="000000"/>
+                <w:sz w:val="24"/>
+                <w:szCs w:val="24"/>
               </w:rPr>
               <w:t>Resolution</w:t>
             </w:r>
@@ -1122,11 +1445,17 @@
             <w:tcW w:w="5180" w:type="dxa"/>
           </w:tcPr>
           <w:p>
-            <w:r>
-              <w:rPr>
-                <w:b w:val="0"/>
-                <w:bCs w:val="0"/>
-                <w:color w:val="000000"/>
+            <w:pPr>
+              <w:spacing w:line="480" w:lineRule="auto"/>
+            </w:pPr>
+            <w:r>
+              <w:rPr>
+                <w:rFonts w:ascii="Times New Roman" w:hAnsi="Times New Roman" w:eastAsia="Times New Roman" w:cs="Times New Roman"/>
+                <w:b w:val="0"/>
+                <w:bCs w:val="0"/>
+                <w:color w:val="000000"/>
+                <w:sz w:val="24"/>
+                <w:szCs w:val="24"/>
               </w:rPr>
               <w:t>PlantVillage (Tomato, Pepper, Potato)</w:t>
             </w:r>
@@ -1137,11 +1466,17 @@
             <w:tcW w:w="5180" w:type="dxa"/>
           </w:tcPr>
           <w:p>
-            <w:r>
-              <w:rPr>
-                <w:b w:val="0"/>
-                <w:bCs w:val="0"/>
-                <w:color w:val="000000"/>
+            <w:pPr>
+              <w:spacing w:line="480" w:lineRule="auto"/>
+            </w:pPr>
+            <w:r>
+              <w:rPr>
+                <w:rFonts w:ascii="Times New Roman" w:hAnsi="Times New Roman" w:eastAsia="Times New Roman" w:cs="Times New Roman"/>
+                <w:b w:val="0"/>
+                <w:bCs w:val="0"/>
+                <w:color w:val="000000"/>
+                <w:sz w:val="24"/>
+                <w:szCs w:val="24"/>
               </w:rPr>
               <w:t>Uniform 256 x 256</w:t>
             </w:r>
@@ -1170,11 +1505,17 @@
             <w:tcW w:w="5180" w:type="dxa"/>
           </w:tcPr>
           <w:p>
-            <w:r>
-              <w:rPr>
-                <w:b w:val="0"/>
-                <w:bCs w:val="0"/>
-                <w:color w:val="000000"/>
+            <w:pPr>
+              <w:spacing w:line="480" w:lineRule="auto"/>
+            </w:pPr>
+            <w:r>
+              <w:rPr>
+                <w:rFonts w:ascii="Times New Roman" w:hAnsi="Times New Roman" w:eastAsia="Times New Roman" w:cs="Times New Roman"/>
+                <w:b w:val="0"/>
+                <w:bCs w:val="0"/>
+                <w:color w:val="000000"/>
+                <w:sz w:val="24"/>
+                <w:szCs w:val="24"/>
               </w:rPr>
               <w:t>Taro</w:t>
             </w:r>
@@ -1185,11 +1526,17 @@
             <w:tcW w:w="5180" w:type="dxa"/>
           </w:tcPr>
           <w:p>
-            <w:r>
-              <w:rPr>
-                <w:b w:val="0"/>
-                <w:bCs w:val="0"/>
-                <w:color w:val="000000"/>
+            <w:pPr>
+              <w:spacing w:line="480" w:lineRule="auto"/>
+            </w:pPr>
+            <w:r>
+              <w:rPr>
+                <w:rFonts w:ascii="Times New Roman" w:hAnsi="Times New Roman" w:eastAsia="Times New Roman" w:cs="Times New Roman"/>
+                <w:b w:val="0"/>
+                <w:bCs w:val="0"/>
+                <w:color w:val="000000"/>
+                <w:sz w:val="24"/>
+                <w:szCs w:val="24"/>
               </w:rPr>
               <w:t>Uniform 640 x 640</w:t>
             </w:r>
@@ -1218,11 +1565,17 @@
             <w:tcW w:w="5180" w:type="dxa"/>
           </w:tcPr>
           <w:p>
-            <w:r>
-              <w:rPr>
-                <w:b w:val="0"/>
-                <w:bCs w:val="0"/>
-                <w:color w:val="000000"/>
+            <w:pPr>
+              <w:spacing w:line="480" w:lineRule="auto"/>
+            </w:pPr>
+            <w:r>
+              <w:rPr>
+                <w:rFonts w:ascii="Times New Roman" w:hAnsi="Times New Roman" w:eastAsia="Times New Roman" w:cs="Times New Roman"/>
+                <w:b w:val="0"/>
+                <w:bCs w:val="0"/>
+                <w:color w:val="000000"/>
+                <w:sz w:val="24"/>
+                <w:szCs w:val="24"/>
               </w:rPr>
               <w:t>Cassava</w:t>
             </w:r>
@@ -1233,11 +1586,17 @@
             <w:tcW w:w="5180" w:type="dxa"/>
           </w:tcPr>
           <w:p>
-            <w:r>
-              <w:rPr>
-                <w:b w:val="0"/>
-                <w:bCs w:val="0"/>
-                <w:color w:val="000000"/>
+            <w:pPr>
+              <w:spacing w:line="480" w:lineRule="auto"/>
+            </w:pPr>
+            <w:r>
+              <w:rPr>
+                <w:rFonts w:ascii="Times New Roman" w:hAnsi="Times New Roman" w:eastAsia="Times New Roman" w:cs="Times New Roman"/>
+                <w:b w:val="0"/>
+                <w:bCs w:val="0"/>
+                <w:color w:val="000000"/>
+                <w:sz w:val="24"/>
+                <w:szCs w:val="24"/>
               </w:rPr>
               <w:t>Uniform 800 x 600</w:t>
             </w:r>
@@ -1266,11 +1625,17 @@
             <w:tcW w:w="5180" w:type="dxa"/>
           </w:tcPr>
           <w:p>
-            <w:r>
-              <w:rPr>
-                <w:b w:val="0"/>
-                <w:bCs w:val="0"/>
-                <w:color w:val="000000"/>
+            <w:pPr>
+              <w:spacing w:line="480" w:lineRule="auto"/>
+            </w:pPr>
+            <w:r>
+              <w:rPr>
+                <w:rFonts w:ascii="Times New Roman" w:hAnsi="Times New Roman" w:eastAsia="Times New Roman" w:cs="Times New Roman"/>
+                <w:b w:val="0"/>
+                <w:bCs w:val="0"/>
+                <w:color w:val="000000"/>
+                <w:sz w:val="24"/>
+                <w:szCs w:val="24"/>
               </w:rPr>
               <w:t>Maize</w:t>
             </w:r>
@@ -1281,11 +1646,17 @@
             <w:tcW w:w="5180" w:type="dxa"/>
           </w:tcPr>
           <w:p>
-            <w:r>
-              <w:rPr>
-                <w:b w:val="0"/>
-                <w:bCs w:val="0"/>
-                <w:color w:val="000000"/>
+            <w:pPr>
+              <w:spacing w:line="480" w:lineRule="auto"/>
+            </w:pPr>
+            <w:r>
+              <w:rPr>
+                <w:rFonts w:ascii="Times New Roman" w:hAnsi="Times New Roman" w:eastAsia="Times New Roman" w:cs="Times New Roman"/>
+                <w:b w:val="0"/>
+                <w:bCs w:val="0"/>
+                <w:color w:val="000000"/>
+                <w:sz w:val="24"/>
+                <w:szCs w:val="24"/>
               </w:rPr>
               <w:t>Variable (188px to 1920x1080), reflecting multi-source aggregation</w:t>
             </w:r>
@@ -1295,34 +1666,47 @@
     </w:tbl>
     <w:p>
       <w:pPr>
-        <w:spacing w:after="300"/>
+        <w:spacing w:after="300" w:line="480" w:lineRule="auto"/>
         <w:jc w:val="center"/>
       </w:pPr>
       <w:r>
         <w:rPr>
+          <w:rFonts w:ascii="Times New Roman" w:hAnsi="Times New Roman" w:eastAsia="Times New Roman" w:cs="Times New Roman"/>
           <w:i/>
           <w:iCs/>
-          <w:color w:val="555555"/>
-          <w:sz w:val="20"/>
-          <w:szCs w:val="20"/>
+          <w:color w:val="000000"/>
+          <w:sz w:val="24"/>
+          <w:szCs w:val="24"/>
         </w:rPr>
         <w:t>Table 2. Native image resolution by data source.</w:t>
       </w:r>
     </w:p>
     <w:p>
       <w:pPr>
-        <w:spacing w:after="160"/>
-      </w:pPr>
-      <w:r>
+        <w:spacing w:after="160" w:line="480" w:lineRule="auto"/>
+      </w:pPr>
+      <w:r>
+        <w:rPr>
+          <w:rFonts w:ascii="Times New Roman" w:hAnsi="Times New Roman" w:eastAsia="Times New Roman" w:cs="Times New Roman"/>
+          <w:color w:val="000000"/>
+          <w:sz w:val="24"/>
+          <w:szCs w:val="24"/>
+        </w:rPr>
         <w:t>Given the resolution inconsistency across and within sources, all images will be resized to a standardized 224 x 224 during preprocessing, matching the input requirements of the Vision Transformer architecture (Dosovitskiy et al., 2021).</w:t>
       </w:r>
     </w:p>
     <w:p>
       <w:pPr>
         <w:pStyle w:val="2"/>
-        <w:spacing w:before="300" w:after="150"/>
-      </w:pPr>
-      <w:r>
+        <w:spacing w:before="300" w:after="150" w:line="480" w:lineRule="auto"/>
+      </w:pPr>
+      <w:r>
+        <w:rPr>
+          <w:rFonts w:ascii="Times New Roman" w:hAnsi="Times New Roman" w:eastAsia="Times New Roman" w:cs="Times New Roman"/>
+          <w:color w:val="000000"/>
+          <w:sz w:val="28"/>
+          <w:szCs w:val="28"/>
+        </w:rPr>
         <w:t>6. Summary</w:t>
       </w:r>
     </w:p>
@@ -1333,10 +1717,16 @@
           <w:ilvl w:val="0"/>
           <w:numId w:val="1"/>
         </w:numPr>
-        <w:spacing w:after="80"/>
-      </w:pPr>
-      <w:r>
-        <w:t>Total validated images: 67,442 across 29 classes and six crops.</w:t>
+        <w:spacing w:after="80" w:line="480" w:lineRule="auto"/>
+      </w:pPr>
+      <w:r>
+        <w:rPr>
+          <w:rFonts w:ascii="Times New Roman" w:hAnsi="Times New Roman" w:eastAsia="Times New Roman" w:cs="Times New Roman"/>
+          <w:color w:val="000000"/>
+          <w:sz w:val="24"/>
+          <w:szCs w:val="24"/>
+        </w:rPr>
+        <w:t>Total validated images: 67,443 across 29 classes and six crops.</w:t>
       </w:r>
     </w:p>
     <w:p>
@@ -1346,9 +1736,15 @@
           <w:ilvl w:val="0"/>
           <w:numId w:val="1"/>
         </w:numPr>
-        <w:spacing w:after="80"/>
-      </w:pPr>
-      <w:r>
+        <w:spacing w:after="80" w:line="480" w:lineRule="auto"/>
+      </w:pPr>
+      <w:r>
+        <w:rPr>
+          <w:rFonts w:ascii="Times New Roman" w:hAnsi="Times New Roman" w:eastAsia="Times New Roman" w:cs="Times New Roman"/>
+          <w:color w:val="000000"/>
+          <w:sz w:val="24"/>
+          <w:szCs w:val="24"/>
+        </w:rPr>
         <w:t>Zero corrupted files remaining after validation and cleanup.</w:t>
       </w:r>
     </w:p>
@@ -1359,9 +1755,15 @@
           <w:ilvl w:val="0"/>
           <w:numId w:val="1"/>
         </w:numPr>
-        <w:spacing w:after="80"/>
-      </w:pPr>
-      <w:r>
+        <w:spacing w:after="80" w:line="480" w:lineRule="auto"/>
+      </w:pPr>
+      <w:r>
+        <w:rPr>
+          <w:rFonts w:ascii="Times New Roman" w:hAnsi="Times New Roman" w:eastAsia="Times New Roman" w:cs="Times New Roman"/>
+          <w:color w:val="000000"/>
+          <w:sz w:val="24"/>
+          <w:szCs w:val="24"/>
+        </w:rPr>
         <w:t>Significant class imbalance identified and documented, both between and within crops — to be addressed via class weighting / augmentation.</w:t>
       </w:r>
     </w:p>
@@ -1372,9 +1774,15 @@
           <w:ilvl w:val="0"/>
           <w:numId w:val="1"/>
         </w:numPr>
-        <w:spacing w:after="80"/>
-      </w:pPr>
-      <w:r>
+        <w:spacing w:after="80" w:line="480" w:lineRule="auto"/>
+      </w:pPr>
+      <w:r>
+        <w:rPr>
+          <w:rFonts w:ascii="Times New Roman" w:hAnsi="Times New Roman" w:eastAsia="Times New Roman" w:cs="Times New Roman"/>
+          <w:color w:val="000000"/>
+          <w:sz w:val="24"/>
+          <w:szCs w:val="24"/>
+        </w:rPr>
         <w:t>Resolution inconsistency identified across all three data sources — to be resolved via standardized resizing to 224 x 224.</w:t>
       </w:r>
     </w:p>
@@ -1385,9 +1793,15 @@
           <w:ilvl w:val="0"/>
           <w:numId w:val="1"/>
         </w:numPr>
-        <w:spacing w:after="80"/>
-      </w:pPr>
-      <w:r>
+        <w:spacing w:after="80" w:line="480" w:lineRule="auto"/>
+      </w:pPr>
+      <w:r>
+        <w:rPr>
+          <w:rFonts w:ascii="Times New Roman" w:hAnsi="Times New Roman" w:eastAsia="Times New Roman" w:cs="Times New Roman"/>
+          <w:color w:val="000000"/>
+          <w:sz w:val="24"/>
+          <w:szCs w:val="24"/>
+        </w:rPr>
         <w:t>Domain-shift risk identified between lab-background (PlantVillage) and field-collected (Taro, Cassava) imagery — flagged for Discussion/Limitations.</w:t>
       </w:r>
     </w:p>
@@ -1398,76 +1812,144 @@
           <w:ilvl w:val="0"/>
           <w:numId w:val="1"/>
         </w:numPr>
-        <w:spacing w:after="80"/>
-      </w:pPr>
-      <w:r>
+        <w:spacing w:after="80" w:line="480" w:lineRule="auto"/>
+      </w:pPr>
+      <w:r>
+        <w:rPr>
+          <w:rFonts w:ascii="Times New Roman" w:hAnsi="Times New Roman" w:eastAsia="Times New Roman" w:cs="Times New Roman"/>
+          <w:color w:val="000000"/>
+          <w:sz w:val="24"/>
+          <w:szCs w:val="24"/>
+        </w:rPr>
         <w:t>Yam data-scarcity finding documented; Taro (cocoyam) substituted as the sixth staple crop.</w:t>
       </w:r>
     </w:p>
     <w:p>
-      <w:r>
+      <w:pPr>
+        <w:spacing w:line="480" w:lineRule="auto"/>
+      </w:pPr>
+      <w:r>
+        <w:rPr>
+          <w:rFonts w:ascii="Times New Roman" w:hAnsi="Times New Roman" w:eastAsia="Times New Roman" w:cs="Times New Roman"/>
+          <w:color w:val="000000"/>
+          <w:sz w:val="24"/>
+          <w:szCs w:val="24"/>
+        </w:rPr>
         <w:br w:type="page"/>
       </w:r>
     </w:p>
     <w:p>
       <w:pPr>
         <w:pStyle w:val="2"/>
-        <w:spacing w:before="300" w:after="150"/>
-      </w:pPr>
-      <w:r>
+        <w:spacing w:before="300" w:after="150" w:line="480" w:lineRule="auto"/>
+      </w:pPr>
+      <w:r>
+        <w:rPr>
+          <w:rFonts w:ascii="Times New Roman" w:hAnsi="Times New Roman" w:eastAsia="Times New Roman" w:cs="Times New Roman"/>
+          <w:color w:val="000000"/>
+          <w:sz w:val="28"/>
+          <w:szCs w:val="28"/>
+        </w:rPr>
         <w:t>Team Contribution Statement</w:t>
       </w:r>
     </w:p>
     <w:p>
       <w:pPr>
-        <w:numPr>
-          <w:ilvl w:val="0"/>
-          <w:numId w:val="2"/>
-        </w:numPr>
-        <w:spacing w:after="160"/>
-        <w:rPr>
-          <w:rFonts w:hint="default"/>
-          <w:lang w:val="en-US"/>
-        </w:rPr>
-      </w:pPr>
-      <w:r>
-        <w:rPr>
-          <w:rFonts w:hint="default"/>
-          <w:lang w:val="en-US"/>
-        </w:rPr>
-        <w:t>Makinde Ayomide Daniel (2023/12127) - Team Lead and Head Project Research</w:t>
-      </w:r>
-    </w:p>
-    <w:p>
-      <w:pPr>
-        <w:numPr>
-          <w:ilvl w:val="0"/>
-          <w:numId w:val="2"/>
-        </w:numPr>
-        <w:spacing w:after="160"/>
-        <w:rPr>
-          <w:rFonts w:hint="default"/>
-          <w:lang w:val="en-US"/>
-        </w:rPr>
-      </w:pPr>
-      <w:r>
-        <w:rPr>
-          <w:rFonts w:hint="default"/>
-          <w:lang w:val="en-US"/>
-        </w:rPr>
-        <w:t>Sanni Smaiat Ajoke ()</w:t>
-      </w:r>
-      <w:bookmarkStart w:id="0" w:name="_GoBack"/>
-      <w:bookmarkEnd w:id="0"/>
-      <w:r>
-        <w:rPr>
-          <w:rFonts w:hint="default"/>
-          <w:lang w:val="en-US"/>
-        </w:rPr>
-        <w:br w:type="textWrapping"/>
+        <w:pStyle w:val="2"/>
+        <w:spacing w:line="480" w:lineRule="auto"/>
+      </w:pPr>
+      <w:r>
+        <w:rPr>
+          <w:rFonts w:ascii="Times New Roman" w:hAnsi="Times New Roman" w:eastAsia="Times New Roman" w:cs="Times New Roman"/>
+          <w:color w:val="000000"/>
+          <w:sz w:val="28"/>
+          <w:szCs w:val="28"/>
+        </w:rPr>
+        <w:t>Makinde Ayomide Daniel (2023/12127) - Team Lead and Implementation Lead</w:t>
+      </w:r>
+    </w:p>
+    <w:p>
+      <w:pPr>
+        <w:pStyle w:val="2"/>
+        <w:spacing w:line="480" w:lineRule="auto"/>
+      </w:pPr>
+      <w:r>
+        <w:rPr>
+          <w:rFonts w:ascii="Times New Roman" w:hAnsi="Times New Roman" w:eastAsia="Times New Roman" w:cs="Times New Roman"/>
+          <w:color w:val="000000"/>
+          <w:sz w:val="28"/>
+          <w:szCs w:val="28"/>
+        </w:rPr>
+        <w:t>Sanni Samiat Ajoke - Literature Reviewer</w:t>
+      </w:r>
+    </w:p>
+    <w:p>
+      <w:pPr>
+        <w:pStyle w:val="2"/>
+        <w:spacing w:line="480" w:lineRule="auto"/>
+      </w:pPr>
+      <w:r>
+        <w:rPr>
+          <w:rFonts w:ascii="Times New Roman" w:hAnsi="Times New Roman" w:eastAsia="Times New Roman" w:cs="Times New Roman"/>
+          <w:color w:val="000000"/>
+          <w:sz w:val="28"/>
+          <w:szCs w:val="28"/>
+        </w:rPr>
+        <w:t>Sodamade Ismail - Writing Coordinator</w:t>
+      </w:r>
+    </w:p>
+    <w:p>
+      <w:pPr>
+        <w:pStyle w:val="2"/>
+        <w:spacing w:line="480" w:lineRule="auto"/>
+      </w:pPr>
+      <w:r>
+        <w:rPr>
+          <w:rFonts w:ascii="Times New Roman" w:hAnsi="Times New Roman" w:eastAsia="Times New Roman" w:cs="Times New Roman"/>
+          <w:color w:val="000000"/>
+          <w:sz w:val="28"/>
+          <w:szCs w:val="28"/>
+        </w:rPr>
+        <w:t>Nweze Sharon - Visualisation Specialist</w:t>
+      </w:r>
+    </w:p>
+    <w:p>
+      <w:pPr>
+        <w:pStyle w:val="2"/>
+        <w:spacing w:line="480" w:lineRule="auto"/>
+      </w:pPr>
+      <w:r>
+        <w:rPr>
+          <w:rFonts w:ascii="Times New Roman" w:hAnsi="Times New Roman" w:eastAsia="Times New Roman" w:cs="Times New Roman"/>
+          <w:color w:val="000000"/>
+          <w:sz w:val="28"/>
+          <w:szCs w:val="28"/>
+        </w:rPr>
+        <w:t>Shittu Qais Ayomide - Documentation Support</w:t>
+      </w:r>
+    </w:p>
+    <w:p>
+      <w:pPr>
+        <w:pStyle w:val="2"/>
+        <w:spacing w:line="480" w:lineRule="auto"/>
+      </w:pPr>
+      <w:r>
+        <w:rPr>
+          <w:rFonts w:ascii="Times New Roman" w:hAnsi="Times New Roman" w:eastAsia="Times New Roman" w:cs="Times New Roman"/>
+          <w:color w:val="000000"/>
+          <w:sz w:val="28"/>
+          <w:szCs w:val="28"/>
+        </w:rPr>
+        <w:t>Izundu Victor Chidera (2023/12156) - Literature Evidence and Evaluation Lead (assigned; review prepared for his verification).</w:t>
       </w:r>
     </w:p>
     <w:sectPr>
+      <w:headerReference w:type="default" r:id="rId8"/>
+      <w:footerReference w:type="default" r:id="rId9"/>
+      <w:headerReference w:type="first" r:id="rId10"/>
+      <w:footerReference w:type="first" r:id="rId11"/>
+      <w:headerReference w:type="even" r:id="rId12"/>
+      <w:footerReference w:type="even" r:id="rId13"/>
       <w:pgSz w:w="12240" w:h="15840"/>
       <w:pgMar w:top="1440" w:right="1440" w:bottom="1440" w:left="1440" w:header="708" w:footer="708" w:gutter="0"/>
       <w:cols w:space="720" w:num="1"/>
@@ -1475,6 +1957,72 @@
     </w:sectPr>
   </w:body>
 </w:document>
+</file>
+
+<file path=word/footer1.xml><?xml version="1.0" encoding="utf-8"?>
+<w:ftr xmlns:m="http://schemas.openxmlformats.org/officeDocument/2006/math" xmlns:mc="http://schemas.openxmlformats.org/markup-compatibility/2006" xmlns:mo="http://schemas.microsoft.com/office/mac/office/2008/main" xmlns:mv="urn:schemas-microsoft-com:mac:vml" xmlns:o="urn:schemas-microsoft-com:office:office" xmlns:r="http://schemas.openxmlformats.org/officeDocument/2006/relationships" xmlns:v="urn:schemas-microsoft-com:vml" xmlns:w10="urn:schemas-microsoft-com:office:word" xmlns:w14="http://schemas.microsoft.com/office/word/2010/wordml" xmlns:w="http://schemas.openxmlformats.org/wordprocessingml/2006/main" xmlns:wne="http://schemas.microsoft.com/office/word/2006/wordml" xmlns:wp14="http://schemas.microsoft.com/office/word/2010/wordprocessingDrawing" xmlns:wp="http://schemas.openxmlformats.org/drawingml/2006/wordprocessingDrawing" xmlns:wpc="http://schemas.microsoft.com/office/word/2010/wordprocessingCanvas" xmlns:wpg="http://schemas.microsoft.com/office/word/2010/wordprocessingGroup" xmlns:wpi="http://schemas.microsoft.com/office/word/2010/wordprocessingInk" xmlns:wps="http://schemas.microsoft.com/office/word/2010/wordprocessingShape" mc:Ignorable="w14 wp14">
+  <w:p>
+    <w:pPr>
+      <w:pStyle w:val="Footer"/>
+      <w:spacing w:line="480" w:lineRule="auto"/>
+    </w:pPr>
+  </w:p>
+</w:ftr>
+</file>
+
+<file path=word/footer2.xml><?xml version="1.0" encoding="utf-8"?>
+<w:ftr xmlns:m="http://schemas.openxmlformats.org/officeDocument/2006/math" xmlns:mc="http://schemas.openxmlformats.org/markup-compatibility/2006" xmlns:mo="http://schemas.microsoft.com/office/mac/office/2008/main" xmlns:mv="urn:schemas-microsoft-com:mac:vml" xmlns:o="urn:schemas-microsoft-com:office:office" xmlns:r="http://schemas.openxmlformats.org/officeDocument/2006/relationships" xmlns:v="urn:schemas-microsoft-com:vml" xmlns:w10="urn:schemas-microsoft-com:office:word" xmlns:w14="http://schemas.microsoft.com/office/word/2010/wordml" xmlns:w="http://schemas.openxmlformats.org/wordprocessingml/2006/main" xmlns:wne="http://schemas.microsoft.com/office/word/2006/wordml" xmlns:wp14="http://schemas.microsoft.com/office/word/2010/wordprocessingDrawing" xmlns:wp="http://schemas.openxmlformats.org/drawingml/2006/wordprocessingDrawing" xmlns:wpc="http://schemas.microsoft.com/office/word/2010/wordprocessingCanvas" xmlns:wpg="http://schemas.microsoft.com/office/word/2010/wordprocessingGroup" xmlns:wpi="http://schemas.microsoft.com/office/word/2010/wordprocessingInk" xmlns:wps="http://schemas.microsoft.com/office/word/2010/wordprocessingShape" mc:Ignorable="w14 wp14">
+  <w:p>
+    <w:pPr>
+      <w:pStyle w:val="Footer"/>
+      <w:spacing w:line="480" w:lineRule="auto"/>
+    </w:pPr>
+  </w:p>
+</w:ftr>
+</file>
+
+<file path=word/footer3.xml><?xml version="1.0" encoding="utf-8"?>
+<w:ftr xmlns:m="http://schemas.openxmlformats.org/officeDocument/2006/math" xmlns:mc="http://schemas.openxmlformats.org/markup-compatibility/2006" xmlns:mo="http://schemas.microsoft.com/office/mac/office/2008/main" xmlns:mv="urn:schemas-microsoft-com:mac:vml" xmlns:o="urn:schemas-microsoft-com:office:office" xmlns:r="http://schemas.openxmlformats.org/officeDocument/2006/relationships" xmlns:v="urn:schemas-microsoft-com:vml" xmlns:w10="urn:schemas-microsoft-com:office:word" xmlns:w14="http://schemas.microsoft.com/office/word/2010/wordml" xmlns:w="http://schemas.openxmlformats.org/wordprocessingml/2006/main" xmlns:wne="http://schemas.microsoft.com/office/word/2006/wordml" xmlns:wp14="http://schemas.microsoft.com/office/word/2010/wordprocessingDrawing" xmlns:wp="http://schemas.openxmlformats.org/drawingml/2006/wordprocessingDrawing" xmlns:wpc="http://schemas.microsoft.com/office/word/2010/wordprocessingCanvas" xmlns:wpg="http://schemas.microsoft.com/office/word/2010/wordprocessingGroup" xmlns:wpi="http://schemas.microsoft.com/office/word/2010/wordprocessingInk" xmlns:wps="http://schemas.microsoft.com/office/word/2010/wordprocessingShape" mc:Ignorable="w14 wp14">
+  <w:p>
+    <w:pPr>
+      <w:pStyle w:val="Footer"/>
+      <w:spacing w:line="480" w:lineRule="auto"/>
+    </w:pPr>
+  </w:p>
+</w:ftr>
+</file>
+
+<file path=word/header1.xml><?xml version="1.0" encoding="utf-8"?>
+<w:hdr xmlns:m="http://schemas.openxmlformats.org/officeDocument/2006/math" xmlns:mc="http://schemas.openxmlformats.org/markup-compatibility/2006" xmlns:mo="http://schemas.microsoft.com/office/mac/office/2008/main" xmlns:mv="urn:schemas-microsoft-com:mac:vml" xmlns:o="urn:schemas-microsoft-com:office:office" xmlns:r="http://schemas.openxmlformats.org/officeDocument/2006/relationships" xmlns:v="urn:schemas-microsoft-com:vml" xmlns:w10="urn:schemas-microsoft-com:office:word" xmlns:w14="http://schemas.microsoft.com/office/word/2010/wordml" xmlns:w="http://schemas.openxmlformats.org/wordprocessingml/2006/main" xmlns:wne="http://schemas.microsoft.com/office/word/2006/wordml" xmlns:wp14="http://schemas.microsoft.com/office/word/2010/wordprocessingDrawing" xmlns:wp="http://schemas.openxmlformats.org/drawingml/2006/wordprocessingDrawing" xmlns:wpc="http://schemas.microsoft.com/office/word/2010/wordprocessingCanvas" xmlns:wpg="http://schemas.microsoft.com/office/word/2010/wordprocessingGroup" xmlns:wpi="http://schemas.microsoft.com/office/word/2010/wordprocessingInk" xmlns:wps="http://schemas.microsoft.com/office/word/2010/wordprocessingShape" mc:Ignorable="w14 wp14">
+  <w:p>
+    <w:pPr>
+      <w:pStyle w:val="Header"/>
+      <w:spacing w:line="480" w:lineRule="auto"/>
+    </w:pPr>
+  </w:p>
+</w:hdr>
+</file>
+
+<file path=word/header2.xml><?xml version="1.0" encoding="utf-8"?>
+<w:hdr xmlns:m="http://schemas.openxmlformats.org/officeDocument/2006/math" xmlns:mc="http://schemas.openxmlformats.org/markup-compatibility/2006" xmlns:mo="http://schemas.microsoft.com/office/mac/office/2008/main" xmlns:mv="urn:schemas-microsoft-com:mac:vml" xmlns:o="urn:schemas-microsoft-com:office:office" xmlns:r="http://schemas.openxmlformats.org/officeDocument/2006/relationships" xmlns:v="urn:schemas-microsoft-com:vml" xmlns:w10="urn:schemas-microsoft-com:office:word" xmlns:w14="http://schemas.microsoft.com/office/word/2010/wordml" xmlns:w="http://schemas.openxmlformats.org/wordprocessingml/2006/main" xmlns:wne="http://schemas.microsoft.com/office/word/2006/wordml" xmlns:wp14="http://schemas.microsoft.com/office/word/2010/wordprocessingDrawing" xmlns:wp="http://schemas.openxmlformats.org/drawingml/2006/wordprocessingDrawing" xmlns:wpc="http://schemas.microsoft.com/office/word/2010/wordprocessingCanvas" xmlns:wpg="http://schemas.microsoft.com/office/word/2010/wordprocessingGroup" xmlns:wpi="http://schemas.microsoft.com/office/word/2010/wordprocessingInk" xmlns:wps="http://schemas.microsoft.com/office/word/2010/wordprocessingShape" mc:Ignorable="w14 wp14">
+  <w:p>
+    <w:pPr>
+      <w:pStyle w:val="Header"/>
+      <w:spacing w:line="480" w:lineRule="auto"/>
+    </w:pPr>
+  </w:p>
+</w:hdr>
+</file>
+
+<file path=word/header3.xml><?xml version="1.0" encoding="utf-8"?>
+<w:hdr xmlns:m="http://schemas.openxmlformats.org/officeDocument/2006/math" xmlns:mc="http://schemas.openxmlformats.org/markup-compatibility/2006" xmlns:mo="http://schemas.microsoft.com/office/mac/office/2008/main" xmlns:mv="urn:schemas-microsoft-com:mac:vml" xmlns:o="urn:schemas-microsoft-com:office:office" xmlns:r="http://schemas.openxmlformats.org/officeDocument/2006/relationships" xmlns:v="urn:schemas-microsoft-com:vml" xmlns:w10="urn:schemas-microsoft-com:office:word" xmlns:w14="http://schemas.microsoft.com/office/word/2010/wordml" xmlns:w="http://schemas.openxmlformats.org/wordprocessingml/2006/main" xmlns:wne="http://schemas.microsoft.com/office/word/2006/wordml" xmlns:wp14="http://schemas.microsoft.com/office/word/2010/wordprocessingDrawing" xmlns:wp="http://schemas.openxmlformats.org/drawingml/2006/wordprocessingDrawing" xmlns:wpc="http://schemas.microsoft.com/office/word/2010/wordprocessingCanvas" xmlns:wpg="http://schemas.microsoft.com/office/word/2010/wordprocessingGroup" xmlns:wpi="http://schemas.microsoft.com/office/word/2010/wordprocessingInk" xmlns:wps="http://schemas.microsoft.com/office/word/2010/wordprocessingShape" mc:Ignorable="w14 wp14">
+  <w:p>
+    <w:pPr>
+      <w:pStyle w:val="Header"/>
+      <w:spacing w:line="480" w:lineRule="auto"/>
+    </w:pPr>
+  </w:p>
+</w:hdr>
 </file>
 
 <file path=word/numbering.xml><?xml version="1.0" encoding="utf-8"?>
@@ -1594,7 +2142,10 @@
   <w:docDefaults>
     <w:rPrDefault>
       <w:rPr>
-        <w:rFonts w:asciiTheme="minorHAnsi" w:hAnsiTheme="minorHAnsi" w:eastAsiaTheme="minorEastAsia" w:cstheme="minorBidi"/>
+        <w:rFonts w:asciiTheme="minorHAnsi" w:hAnsiTheme="minorHAnsi" w:eastAsiaTheme="minorEastAsia" w:cstheme="minorBidi" w:ascii="Times New Roman" w:hAnsi="Times New Roman" w:eastAsia="Times New Roman" w:cs="Times New Roman"/>
+        <w:color w:val="000000"/>
+        <w:sz w:val="24"/>
+        <w:szCs w:val="24"/>
       </w:rPr>
     </w:rPrDefault>
     <w:pPrDefault/>
@@ -1855,8 +2406,10 @@
     <w:qFormat/>
     <w:uiPriority w:val="0"/>
     <w:rPr>
-      <w:sz w:val="21"/>
-      <w:szCs w:val="22"/>
+      <w:rFonts w:ascii="Times New Roman" w:hAnsi="Times New Roman" w:eastAsia="Times New Roman" w:cs="Times New Roman"/>
+      <w:color w:val="000000"/>
+      <w:sz w:val="24"/>
+      <w:szCs w:val="24"/>
     </w:rPr>
   </w:style>
   <w:style w:type="paragraph" w:styleId="2">
@@ -1865,9 +2418,10 @@
     <w:qFormat/>
     <w:uiPriority w:val="0"/>
     <w:rPr>
-      <w:color w:val="2E74B5"/>
-      <w:sz w:val="32"/>
-      <w:szCs w:val="32"/>
+      <w:rFonts w:ascii="Times New Roman" w:hAnsi="Times New Roman" w:eastAsia="Times New Roman" w:cs="Times New Roman"/>
+      <w:color w:val="000000"/>
+      <w:sz w:val="28"/>
+      <w:szCs w:val="28"/>
     </w:rPr>
   </w:style>
   <w:style w:type="paragraph" w:styleId="3">
@@ -1876,9 +2430,10 @@
     <w:qFormat/>
     <w:uiPriority w:val="0"/>
     <w:rPr>
-      <w:color w:val="2E74B5"/>
-      <w:sz w:val="26"/>
-      <w:szCs w:val="26"/>
+      <w:rFonts w:ascii="Times New Roman" w:hAnsi="Times New Roman" w:eastAsia="Times New Roman" w:cs="Times New Roman"/>
+      <w:color w:val="000000"/>
+      <w:sz w:val="28"/>
+      <w:szCs w:val="28"/>
     </w:rPr>
   </w:style>
   <w:style w:type="paragraph" w:styleId="4">
@@ -1887,9 +2442,10 @@
     <w:qFormat/>
     <w:uiPriority w:val="0"/>
     <w:rPr>
-      <w:color w:val="1F4D78"/>
-      <w:sz w:val="24"/>
-      <w:szCs w:val="24"/>
+      <w:rFonts w:ascii="Times New Roman" w:hAnsi="Times New Roman" w:eastAsia="Times New Roman" w:cs="Times New Roman"/>
+      <w:color w:val="000000"/>
+      <w:sz w:val="28"/>
+      <w:szCs w:val="28"/>
     </w:rPr>
   </w:style>
   <w:style w:type="paragraph" w:styleId="5">
@@ -1898,11 +2454,12 @@
     <w:qFormat/>
     <w:uiPriority w:val="0"/>
     <w:rPr>
+      <w:rFonts w:ascii="Times New Roman" w:hAnsi="Times New Roman" w:eastAsia="Times New Roman" w:cs="Times New Roman"/>
       <w:i/>
       <w:iCs/>
-      <w:color w:val="2E74B5"/>
-      <w:sz w:val="21"/>
-      <w:szCs w:val="22"/>
+      <w:color w:val="000000"/>
+      <w:sz w:val="28"/>
+      <w:szCs w:val="28"/>
     </w:rPr>
   </w:style>
   <w:style w:type="paragraph" w:styleId="6">
@@ -1911,9 +2468,10 @@
     <w:qFormat/>
     <w:uiPriority w:val="0"/>
     <w:rPr>
-      <w:color w:val="2E74B5"/>
-      <w:sz w:val="21"/>
-      <w:szCs w:val="22"/>
+      <w:rFonts w:ascii="Times New Roman" w:hAnsi="Times New Roman" w:eastAsia="Times New Roman" w:cs="Times New Roman"/>
+      <w:color w:val="000000"/>
+      <w:sz w:val="28"/>
+      <w:szCs w:val="28"/>
     </w:rPr>
   </w:style>
   <w:style w:type="paragraph" w:styleId="7">
@@ -1922,20 +2480,33 @@
     <w:qFormat/>
     <w:uiPriority w:val="0"/>
     <w:rPr>
-      <w:color w:val="1F4D78"/>
-      <w:sz w:val="21"/>
-      <w:szCs w:val="22"/>
+      <w:rFonts w:ascii="Times New Roman" w:hAnsi="Times New Roman" w:eastAsia="Times New Roman" w:cs="Times New Roman"/>
+      <w:color w:val="000000"/>
+      <w:sz w:val="28"/>
+      <w:szCs w:val="28"/>
     </w:rPr>
   </w:style>
   <w:style w:type="character" w:default="1" w:styleId="8">
     <w:name w:val="Default Paragraph Font"/>
     <w:semiHidden/>
     <w:uiPriority w:val="0"/>
+    <w:rPr>
+      <w:rFonts w:ascii="Times New Roman" w:hAnsi="Times New Roman" w:eastAsia="Times New Roman" w:cs="Times New Roman"/>
+      <w:color w:val="000000"/>
+      <w:sz w:val="24"/>
+      <w:szCs w:val="24"/>
+    </w:rPr>
   </w:style>
   <w:style w:type="table" w:default="1" w:styleId="9">
     <w:name w:val="Normal Table"/>
     <w:semiHidden/>
     <w:uiPriority w:val="0"/>
+    <w:rPr>
+      <w:rFonts w:ascii="Times New Roman" w:hAnsi="Times New Roman" w:eastAsia="Times New Roman" w:cs="Times New Roman"/>
+      <w:color w:val="000000"/>
+      <w:sz w:val="24"/>
+      <w:szCs w:val="24"/>
+    </w:rPr>
     <w:tblPr>
       <w:tblCellMar>
         <w:top w:w="0" w:type="dxa"/>
@@ -1951,7 +2522,11 @@
     <w:unhideWhenUsed/>
     <w:uiPriority w:val="99"/>
     <w:rPr>
+      <w:rFonts w:ascii="Times New Roman" w:hAnsi="Times New Roman" w:eastAsia="Times New Roman" w:cs="Times New Roman"/>
+      <w:color w:val="000000"/>
+      <w:sz w:val="24"/>
       <w:vertAlign w:val="superscript"/>
+      <w:szCs w:val="24"/>
     </w:rPr>
   </w:style>
   <w:style w:type="paragraph" w:styleId="11">
@@ -1964,8 +2539,10 @@
       <w:spacing w:after="0" w:line="240" w:lineRule="auto"/>
     </w:pPr>
     <w:rPr>
-      <w:sz w:val="20"/>
-      <w:szCs w:val="20"/>
+      <w:rFonts w:ascii="Times New Roman" w:hAnsi="Times New Roman" w:eastAsia="Times New Roman" w:cs="Times New Roman"/>
+      <w:color w:val="000000"/>
+      <w:sz w:val="24"/>
+      <w:szCs w:val="24"/>
     </w:rPr>
   </w:style>
   <w:style w:type="character" w:styleId="12">
@@ -1974,7 +2551,11 @@
     <w:unhideWhenUsed/>
     <w:uiPriority w:val="99"/>
     <w:rPr>
+      <w:rFonts w:ascii="Times New Roman" w:hAnsi="Times New Roman" w:eastAsia="Times New Roman" w:cs="Times New Roman"/>
+      <w:color w:val="000000"/>
+      <w:sz w:val="24"/>
       <w:vertAlign w:val="superscript"/>
+      <w:szCs w:val="24"/>
     </w:rPr>
   </w:style>
   <w:style w:type="paragraph" w:styleId="13">
@@ -1987,8 +2568,10 @@
       <w:spacing w:after="0" w:line="240" w:lineRule="auto"/>
     </w:pPr>
     <w:rPr>
-      <w:sz w:val="20"/>
-      <w:szCs w:val="20"/>
+      <w:rFonts w:ascii="Times New Roman" w:hAnsi="Times New Roman" w:eastAsia="Times New Roman" w:cs="Times New Roman"/>
+      <w:color w:val="000000"/>
+      <w:sz w:val="24"/>
+      <w:szCs w:val="24"/>
     </w:rPr>
   </w:style>
   <w:style w:type="character" w:styleId="14">
@@ -1996,8 +2579,11 @@
     <w:unhideWhenUsed/>
     <w:uiPriority w:val="99"/>
     <w:rPr>
-      <w:color w:val="0563C1"/>
+      <w:rFonts w:ascii="Times New Roman" w:hAnsi="Times New Roman" w:eastAsia="Times New Roman" w:cs="Times New Roman"/>
+      <w:color w:val="000000"/>
+      <w:sz w:val="24"/>
       <w:u w:val="single"/>
+      <w:szCs w:val="24"/>
     </w:rPr>
   </w:style>
   <w:style w:type="paragraph" w:styleId="15">
@@ -2005,8 +2591,10 @@
     <w:qFormat/>
     <w:uiPriority w:val="0"/>
     <w:rPr>
-      <w:sz w:val="56"/>
-      <w:szCs w:val="56"/>
+      <w:rFonts w:ascii="Times New Roman" w:hAnsi="Times New Roman" w:eastAsia="Times New Roman" w:cs="Times New Roman"/>
+      <w:color w:val="000000"/>
+      <w:sz w:val="28"/>
+      <w:szCs w:val="28"/>
     </w:rPr>
   </w:style>
   <w:style w:type="paragraph" w:styleId="16">
@@ -2014,8 +2602,10 @@
     <w:qFormat/>
     <w:uiPriority w:val="0"/>
     <w:rPr>
-      <w:sz w:val="21"/>
-      <w:szCs w:val="22"/>
+      <w:rFonts w:ascii="Times New Roman" w:hAnsi="Times New Roman" w:eastAsia="Times New Roman" w:cs="Times New Roman"/>
+      <w:color w:val="000000"/>
+      <w:sz w:val="24"/>
+      <w:szCs w:val="24"/>
     </w:rPr>
   </w:style>
   <w:style w:type="character" w:customStyle="1" w:styleId="17">
@@ -2025,8 +2615,10 @@
     <w:unhideWhenUsed/>
     <w:uiPriority w:val="99"/>
     <w:rPr>
-      <w:sz w:val="20"/>
-      <w:szCs w:val="20"/>
+      <w:rFonts w:ascii="Times New Roman" w:hAnsi="Times New Roman" w:eastAsia="Times New Roman" w:cs="Times New Roman"/>
+      <w:color w:val="000000"/>
+      <w:sz w:val="24"/>
+      <w:szCs w:val="24"/>
     </w:rPr>
   </w:style>
   <w:style w:type="character" w:customStyle="1" w:styleId="18">
@@ -2036,8 +2628,10 @@
     <w:unhideWhenUsed/>
     <w:uiPriority w:val="99"/>
     <w:rPr>
-      <w:sz w:val="20"/>
-      <w:szCs w:val="20"/>
+      <w:rFonts w:ascii="Times New Roman" w:hAnsi="Times New Roman" w:eastAsia="Times New Roman" w:cs="Times New Roman"/>
+      <w:color w:val="000000"/>
+      <w:sz w:val="24"/>
+      <w:szCs w:val="24"/>
     </w:rPr>
   </w:style>
 </w:styles>

</xml_diff>

<commit_message>
Add team matric numbers
</commit_message>
<xml_diff>
--- a/docs/EDA_Report_UniPlant_WA.docx
+++ b/docs/EDA_Report_UniPlant_WA.docx
@@ -12,9 +12,9 @@
           <w:rFonts w:ascii="Times New Roman" w:hAnsi="Times New Roman" w:eastAsia="Times New Roman" w:cs="Times New Roman"/>
           <w:b/>
           <w:bCs/>
+          <w:color w:val="000000"/>
           <w:sz w:val="28"/>
           <w:szCs w:val="28"/>
-          <w:color w:val="000000"/>
         </w:rPr>
         <w:t>Data Acquisition &amp; Exploratory Data Analysis</w:t>
       </w:r>
@@ -102,10 +102,10 @@
         </w:tblCellMar>
       </w:tblPr>
       <w:tblGrid>
-        <w:gridCol w:w="1990"/>
-        <w:gridCol w:w="3782"/>
-        <w:gridCol w:w="1553"/>
-        <w:gridCol w:w="2035"/>
+        <w:gridCol w:w="1989"/>
+        <w:gridCol w:w="3780"/>
+        <w:gridCol w:w="1559"/>
+        <w:gridCol w:w="2032"/>
       </w:tblGrid>
       <w:tr>
         <w:tblPrEx>
@@ -1047,7 +1047,7 @@
                     </pic:cNvPicPr>
                   </pic:nvPicPr>
                   <pic:blipFill>
-                    <a:blip r:embed="rId4"/>
+                    <a:blip r:embed="rId10"/>
                     <a:srcRect/>
                     <a:stretch>
                       <a:fillRect/>
@@ -1256,7 +1256,7 @@
                     </pic:cNvPicPr>
                   </pic:nvPicPr>
                   <pic:blipFill>
-                    <a:blip r:embed="rId5"/>
+                    <a:blip r:embed="rId11"/>
                     <a:srcRect/>
                     <a:stretch>
                       <a:fillRect/>
@@ -1360,8 +1360,8 @@
         </w:tblCellMar>
       </w:tblPr>
       <w:tblGrid>
-        <w:gridCol w:w="4677"/>
-        <w:gridCol w:w="4683"/>
+        <w:gridCol w:w="4679"/>
+        <w:gridCol w:w="4681"/>
       </w:tblGrid>
       <w:tr>
         <w:tblPrEx>
@@ -1699,7 +1699,45 @@
       <w:pPr>
         <w:pStyle w:val="2"/>
         <w:spacing w:before="300" w:after="150" w:line="480" w:lineRule="auto"/>
-      </w:pPr>
+        <w:rPr>
+          <w:rFonts w:ascii="Times New Roman" w:hAnsi="Times New Roman" w:eastAsia="Times New Roman" w:cs="Times New Roman"/>
+          <w:color w:val="000000"/>
+          <w:sz w:val="28"/>
+          <w:szCs w:val="28"/>
+        </w:rPr>
+      </w:pPr>
+    </w:p>
+    <w:p>
+      <w:pPr>
+        <w:pStyle w:val="2"/>
+        <w:spacing w:before="300" w:after="150" w:line="480" w:lineRule="auto"/>
+        <w:rPr>
+          <w:rFonts w:ascii="Times New Roman" w:hAnsi="Times New Roman" w:eastAsia="Times New Roman" w:cs="Times New Roman"/>
+          <w:color w:val="000000"/>
+          <w:sz w:val="28"/>
+          <w:szCs w:val="28"/>
+        </w:rPr>
+      </w:pPr>
+    </w:p>
+    <w:p>
+      <w:pPr>
+        <w:pStyle w:val="2"/>
+        <w:spacing w:before="300" w:after="150" w:line="480" w:lineRule="auto"/>
+        <w:rPr>
+          <w:rFonts w:ascii="Times New Roman" w:hAnsi="Times New Roman" w:eastAsia="Times New Roman" w:cs="Times New Roman"/>
+          <w:color w:val="000000"/>
+          <w:sz w:val="28"/>
+          <w:szCs w:val="28"/>
+        </w:rPr>
+      </w:pPr>
+    </w:p>
+    <w:p>
+      <w:pPr>
+        <w:pStyle w:val="2"/>
+        <w:spacing w:before="300" w:after="150" w:line="480" w:lineRule="auto"/>
+      </w:pPr>
+      <w:bookmarkStart w:id="0" w:name="_GoBack"/>
+      <w:bookmarkEnd w:id="0"/>
       <w:r>
         <w:rPr>
           <w:rFonts w:ascii="Times New Roman" w:hAnsi="Times New Roman" w:eastAsia="Times New Roman" w:cs="Times New Roman"/>
@@ -1857,13 +1895,17 @@
       <w:pPr>
         <w:pStyle w:val="2"/>
         <w:spacing w:line="480" w:lineRule="auto"/>
-      </w:pPr>
-      <w:r>
-        <w:rPr>
-          <w:rFonts w:ascii="Times New Roman" w:hAnsi="Times New Roman" w:eastAsia="Times New Roman" w:cs="Times New Roman"/>
-          <w:color w:val="000000"/>
-          <w:sz w:val="28"/>
-          <w:szCs w:val="28"/>
+        <w:rPr>
+          <w:sz w:val="24"/>
+          <w:szCs w:val="24"/>
+        </w:rPr>
+      </w:pPr>
+      <w:r>
+        <w:rPr>
+          <w:rFonts w:ascii="Times New Roman" w:hAnsi="Times New Roman" w:eastAsia="Times New Roman" w:cs="Times New Roman"/>
+          <w:color w:val="000000"/>
+          <w:sz w:val="24"/>
+          <w:szCs w:val="24"/>
         </w:rPr>
         <w:t>Makinde Ayomide Daniel (2023/12127) - Team Lead and Implementation Lead</w:t>
       </w:r>
@@ -1877,10 +1919,10 @@
         <w:rPr>
           <w:rFonts w:ascii="Times New Roman" w:hAnsi="Times New Roman" w:eastAsia="Times New Roman" w:cs="Times New Roman"/>
           <w:color w:val="000000"/>
-          <w:sz w:val="28"/>
+          <w:sz w:val="24"/>
           <w:szCs w:val="28"/>
         </w:rPr>
-        <w:t>Sanni Samiat Ajoke - Literature Reviewer</w:t>
+        <w:t>Sanni Samiat Ajoke (2023/12454) - Literature Reviewer</w:t>
       </w:r>
     </w:p>
     <w:p>
@@ -1892,10 +1934,10 @@
         <w:rPr>
           <w:rFonts w:ascii="Times New Roman" w:hAnsi="Times New Roman" w:eastAsia="Times New Roman" w:cs="Times New Roman"/>
           <w:color w:val="000000"/>
-          <w:sz w:val="28"/>
+          <w:sz w:val="24"/>
           <w:szCs w:val="28"/>
         </w:rPr>
-        <w:t>Sodamade Ismail - Writing Coordinator</w:t>
+        <w:t>Sodamade Ismail (2023/12228) - Writing Coordinator</w:t>
       </w:r>
     </w:p>
     <w:p>
@@ -1907,10 +1949,10 @@
         <w:rPr>
           <w:rFonts w:ascii="Times New Roman" w:hAnsi="Times New Roman" w:eastAsia="Times New Roman" w:cs="Times New Roman"/>
           <w:color w:val="000000"/>
-          <w:sz w:val="28"/>
+          <w:sz w:val="24"/>
           <w:szCs w:val="28"/>
         </w:rPr>
-        <w:t>Nweze Sharon - Visualisation Specialist</w:t>
+        <w:t>Nweze Sharon Adaeze (2023/12602) - Visualisation Specialist</w:t>
       </w:r>
     </w:p>
     <w:p>
@@ -1922,34 +1964,38 @@
         <w:rPr>
           <w:rFonts w:ascii="Times New Roman" w:hAnsi="Times New Roman" w:eastAsia="Times New Roman" w:cs="Times New Roman"/>
           <w:color w:val="000000"/>
-          <w:sz w:val="28"/>
+          <w:sz w:val="24"/>
           <w:szCs w:val="28"/>
         </w:rPr>
-        <w:t>Shittu Qais Ayomide - Documentation Support</w:t>
+        <w:t>Shittu Qais Ayomide (2023/12688) - Documentation Support</w:t>
       </w:r>
     </w:p>
     <w:p>
       <w:pPr>
         <w:pStyle w:val="2"/>
         <w:spacing w:line="480" w:lineRule="auto"/>
-      </w:pPr>
-      <w:r>
-        <w:rPr>
-          <w:rFonts w:ascii="Times New Roman" w:hAnsi="Times New Roman" w:eastAsia="Times New Roman" w:cs="Times New Roman"/>
-          <w:color w:val="000000"/>
-          <w:sz w:val="28"/>
-          <w:szCs w:val="28"/>
+        <w:rPr>
+          <w:sz w:val="24"/>
+          <w:szCs w:val="24"/>
+        </w:rPr>
+      </w:pPr>
+      <w:r>
+        <w:rPr>
+          <w:rFonts w:ascii="Times New Roman" w:hAnsi="Times New Roman" w:eastAsia="Times New Roman" w:cs="Times New Roman"/>
+          <w:color w:val="000000"/>
+          <w:sz w:val="24"/>
+          <w:szCs w:val="24"/>
         </w:rPr>
         <w:t>Izundu Victor Chidera (2023/12156) - Literature Evidence and Evaluation Lead (assigned; review prepared for his verification).</w:t>
       </w:r>
     </w:p>
     <w:sectPr>
-      <w:headerReference w:type="default" r:id="rId8"/>
-      <w:footerReference w:type="default" r:id="rId9"/>
-      <w:headerReference w:type="first" r:id="rId10"/>
-      <w:footerReference w:type="first" r:id="rId11"/>
-      <w:headerReference w:type="even" r:id="rId12"/>
-      <w:footerReference w:type="even" r:id="rId13"/>
+      <w:headerReference r:id="rId5" w:type="first"/>
+      <w:footerReference r:id="rId8" w:type="first"/>
+      <w:headerReference r:id="rId3" w:type="default"/>
+      <w:footerReference r:id="rId6" w:type="default"/>
+      <w:headerReference r:id="rId4" w:type="even"/>
+      <w:footerReference r:id="rId7" w:type="even"/>
       <w:pgSz w:w="12240" w:h="15840"/>
       <w:pgMar w:top="1440" w:right="1440" w:bottom="1440" w:left="1440" w:header="708" w:footer="708" w:gutter="0"/>
       <w:cols w:space="720" w:num="1"/>
@@ -1960,10 +2006,9 @@
 </file>
 
 <file path=word/footer1.xml><?xml version="1.0" encoding="utf-8"?>
-<w:ftr xmlns:m="http://schemas.openxmlformats.org/officeDocument/2006/math" xmlns:mc="http://schemas.openxmlformats.org/markup-compatibility/2006" xmlns:mo="http://schemas.microsoft.com/office/mac/office/2008/main" xmlns:mv="urn:schemas-microsoft-com:mac:vml" xmlns:o="urn:schemas-microsoft-com:office:office" xmlns:r="http://schemas.openxmlformats.org/officeDocument/2006/relationships" xmlns:v="urn:schemas-microsoft-com:vml" xmlns:w10="urn:schemas-microsoft-com:office:word" xmlns:w14="http://schemas.microsoft.com/office/word/2010/wordml" xmlns:w="http://schemas.openxmlformats.org/wordprocessingml/2006/main" xmlns:wne="http://schemas.microsoft.com/office/word/2006/wordml" xmlns:wp14="http://schemas.microsoft.com/office/word/2010/wordprocessingDrawing" xmlns:wp="http://schemas.openxmlformats.org/drawingml/2006/wordprocessingDrawing" xmlns:wpc="http://schemas.microsoft.com/office/word/2010/wordprocessingCanvas" xmlns:wpg="http://schemas.microsoft.com/office/word/2010/wordprocessingGroup" xmlns:wpi="http://schemas.microsoft.com/office/word/2010/wordprocessingInk" xmlns:wps="http://schemas.microsoft.com/office/word/2010/wordprocessingShape" mc:Ignorable="w14 wp14">
+<w:ftr xmlns:wpc="http://schemas.microsoft.com/office/word/2010/wordprocessingCanvas" xmlns:mc="http://schemas.openxmlformats.org/markup-compatibility/2006" xmlns:o="urn:schemas-microsoft-com:office:office" xmlns:r="http://schemas.openxmlformats.org/officeDocument/2006/relationships" xmlns:m="http://schemas.openxmlformats.org/officeDocument/2006/math" xmlns:v="urn:schemas-microsoft-com:vml" xmlns:wp14="http://schemas.microsoft.com/office/word/2010/wordprocessingDrawing" xmlns:wp="http://schemas.openxmlformats.org/drawingml/2006/wordprocessingDrawing" xmlns:w10="urn:schemas-microsoft-com:office:word" xmlns:w="http://schemas.openxmlformats.org/wordprocessingml/2006/main" xmlns:w14="http://schemas.microsoft.com/office/word/2010/wordml" xmlns:w15="http://schemas.microsoft.com/office/word/2012/wordml" xmlns:wpg="http://schemas.microsoft.com/office/word/2010/wordprocessingGroup" xmlns:wpi="http://schemas.microsoft.com/office/word/2010/wordprocessingInk" xmlns:wne="http://schemas.microsoft.com/office/word/2006/wordml" xmlns:wps="http://schemas.microsoft.com/office/word/2010/wordprocessingShape" xmlns:wpsCustomData="http://www.wps.cn/officeDocument/2013/wpsCustomData" mc:Ignorable="w14 w15 wp14">
   <w:p>
     <w:pPr>
-      <w:pStyle w:val="Footer"/>
       <w:spacing w:line="480" w:lineRule="auto"/>
     </w:pPr>
   </w:p>
@@ -1971,10 +2016,9 @@
 </file>
 
 <file path=word/footer2.xml><?xml version="1.0" encoding="utf-8"?>
-<w:ftr xmlns:m="http://schemas.openxmlformats.org/officeDocument/2006/math" xmlns:mc="http://schemas.openxmlformats.org/markup-compatibility/2006" xmlns:mo="http://schemas.microsoft.com/office/mac/office/2008/main" xmlns:mv="urn:schemas-microsoft-com:mac:vml" xmlns:o="urn:schemas-microsoft-com:office:office" xmlns:r="http://schemas.openxmlformats.org/officeDocument/2006/relationships" xmlns:v="urn:schemas-microsoft-com:vml" xmlns:w10="urn:schemas-microsoft-com:office:word" xmlns:w14="http://schemas.microsoft.com/office/word/2010/wordml" xmlns:w="http://schemas.openxmlformats.org/wordprocessingml/2006/main" xmlns:wne="http://schemas.microsoft.com/office/word/2006/wordml" xmlns:wp14="http://schemas.microsoft.com/office/word/2010/wordprocessingDrawing" xmlns:wp="http://schemas.openxmlformats.org/drawingml/2006/wordprocessingDrawing" xmlns:wpc="http://schemas.microsoft.com/office/word/2010/wordprocessingCanvas" xmlns:wpg="http://schemas.microsoft.com/office/word/2010/wordprocessingGroup" xmlns:wpi="http://schemas.microsoft.com/office/word/2010/wordprocessingInk" xmlns:wps="http://schemas.microsoft.com/office/word/2010/wordprocessingShape" mc:Ignorable="w14 wp14">
+<w:ftr xmlns:wpc="http://schemas.microsoft.com/office/word/2010/wordprocessingCanvas" xmlns:mc="http://schemas.openxmlformats.org/markup-compatibility/2006" xmlns:o="urn:schemas-microsoft-com:office:office" xmlns:r="http://schemas.openxmlformats.org/officeDocument/2006/relationships" xmlns:m="http://schemas.openxmlformats.org/officeDocument/2006/math" xmlns:v="urn:schemas-microsoft-com:vml" xmlns:wp14="http://schemas.microsoft.com/office/word/2010/wordprocessingDrawing" xmlns:wp="http://schemas.openxmlformats.org/drawingml/2006/wordprocessingDrawing" xmlns:w10="urn:schemas-microsoft-com:office:word" xmlns:w="http://schemas.openxmlformats.org/wordprocessingml/2006/main" xmlns:w14="http://schemas.microsoft.com/office/word/2010/wordml" xmlns:w15="http://schemas.microsoft.com/office/word/2012/wordml" xmlns:wpg="http://schemas.microsoft.com/office/word/2010/wordprocessingGroup" xmlns:wpi="http://schemas.microsoft.com/office/word/2010/wordprocessingInk" xmlns:wne="http://schemas.microsoft.com/office/word/2006/wordml" xmlns:wps="http://schemas.microsoft.com/office/word/2010/wordprocessingShape" xmlns:wpsCustomData="http://www.wps.cn/officeDocument/2013/wpsCustomData" mc:Ignorable="w14 w15 wp14">
   <w:p>
     <w:pPr>
-      <w:pStyle w:val="Footer"/>
       <w:spacing w:line="480" w:lineRule="auto"/>
     </w:pPr>
   </w:p>
@@ -1982,10 +2026,9 @@
 </file>
 
 <file path=word/footer3.xml><?xml version="1.0" encoding="utf-8"?>
-<w:ftr xmlns:m="http://schemas.openxmlformats.org/officeDocument/2006/math" xmlns:mc="http://schemas.openxmlformats.org/markup-compatibility/2006" xmlns:mo="http://schemas.microsoft.com/office/mac/office/2008/main" xmlns:mv="urn:schemas-microsoft-com:mac:vml" xmlns:o="urn:schemas-microsoft-com:office:office" xmlns:r="http://schemas.openxmlformats.org/officeDocument/2006/relationships" xmlns:v="urn:schemas-microsoft-com:vml" xmlns:w10="urn:schemas-microsoft-com:office:word" xmlns:w14="http://schemas.microsoft.com/office/word/2010/wordml" xmlns:w="http://schemas.openxmlformats.org/wordprocessingml/2006/main" xmlns:wne="http://schemas.microsoft.com/office/word/2006/wordml" xmlns:wp14="http://schemas.microsoft.com/office/word/2010/wordprocessingDrawing" xmlns:wp="http://schemas.openxmlformats.org/drawingml/2006/wordprocessingDrawing" xmlns:wpc="http://schemas.microsoft.com/office/word/2010/wordprocessingCanvas" xmlns:wpg="http://schemas.microsoft.com/office/word/2010/wordprocessingGroup" xmlns:wpi="http://schemas.microsoft.com/office/word/2010/wordprocessingInk" xmlns:wps="http://schemas.microsoft.com/office/word/2010/wordprocessingShape" mc:Ignorable="w14 wp14">
+<w:ftr xmlns:wpc="http://schemas.microsoft.com/office/word/2010/wordprocessingCanvas" xmlns:mc="http://schemas.openxmlformats.org/markup-compatibility/2006" xmlns:o="urn:schemas-microsoft-com:office:office" xmlns:r="http://schemas.openxmlformats.org/officeDocument/2006/relationships" xmlns:m="http://schemas.openxmlformats.org/officeDocument/2006/math" xmlns:v="urn:schemas-microsoft-com:vml" xmlns:wp14="http://schemas.microsoft.com/office/word/2010/wordprocessingDrawing" xmlns:wp="http://schemas.openxmlformats.org/drawingml/2006/wordprocessingDrawing" xmlns:w10="urn:schemas-microsoft-com:office:word" xmlns:w="http://schemas.openxmlformats.org/wordprocessingml/2006/main" xmlns:w14="http://schemas.microsoft.com/office/word/2010/wordml" xmlns:w15="http://schemas.microsoft.com/office/word/2012/wordml" xmlns:wpg="http://schemas.microsoft.com/office/word/2010/wordprocessingGroup" xmlns:wpi="http://schemas.microsoft.com/office/word/2010/wordprocessingInk" xmlns:wne="http://schemas.microsoft.com/office/word/2006/wordml" xmlns:wps="http://schemas.microsoft.com/office/word/2010/wordprocessingShape" xmlns:wpsCustomData="http://www.wps.cn/officeDocument/2013/wpsCustomData" mc:Ignorable="w14 w15 wp14">
   <w:p>
     <w:pPr>
-      <w:pStyle w:val="Footer"/>
       <w:spacing w:line="480" w:lineRule="auto"/>
     </w:pPr>
   </w:p>
@@ -1993,10 +2036,9 @@
 </file>
 
 <file path=word/header1.xml><?xml version="1.0" encoding="utf-8"?>
-<w:hdr xmlns:m="http://schemas.openxmlformats.org/officeDocument/2006/math" xmlns:mc="http://schemas.openxmlformats.org/markup-compatibility/2006" xmlns:mo="http://schemas.microsoft.com/office/mac/office/2008/main" xmlns:mv="urn:schemas-microsoft-com:mac:vml" xmlns:o="urn:schemas-microsoft-com:office:office" xmlns:r="http://schemas.openxmlformats.org/officeDocument/2006/relationships" xmlns:v="urn:schemas-microsoft-com:vml" xmlns:w10="urn:schemas-microsoft-com:office:word" xmlns:w14="http://schemas.microsoft.com/office/word/2010/wordml" xmlns:w="http://schemas.openxmlformats.org/wordprocessingml/2006/main" xmlns:wne="http://schemas.microsoft.com/office/word/2006/wordml" xmlns:wp14="http://schemas.microsoft.com/office/word/2010/wordprocessingDrawing" xmlns:wp="http://schemas.openxmlformats.org/drawingml/2006/wordprocessingDrawing" xmlns:wpc="http://schemas.microsoft.com/office/word/2010/wordprocessingCanvas" xmlns:wpg="http://schemas.microsoft.com/office/word/2010/wordprocessingGroup" xmlns:wpi="http://schemas.microsoft.com/office/word/2010/wordprocessingInk" xmlns:wps="http://schemas.microsoft.com/office/word/2010/wordprocessingShape" mc:Ignorable="w14 wp14">
+<w:hdr xmlns:wpc="http://schemas.microsoft.com/office/word/2010/wordprocessingCanvas" xmlns:mc="http://schemas.openxmlformats.org/markup-compatibility/2006" xmlns:o="urn:schemas-microsoft-com:office:office" xmlns:r="http://schemas.openxmlformats.org/officeDocument/2006/relationships" xmlns:m="http://schemas.openxmlformats.org/officeDocument/2006/math" xmlns:v="urn:schemas-microsoft-com:vml" xmlns:wp14="http://schemas.microsoft.com/office/word/2010/wordprocessingDrawing" xmlns:wp="http://schemas.openxmlformats.org/drawingml/2006/wordprocessingDrawing" xmlns:w10="urn:schemas-microsoft-com:office:word" xmlns:w="http://schemas.openxmlformats.org/wordprocessingml/2006/main" xmlns:w14="http://schemas.microsoft.com/office/word/2010/wordml" xmlns:w15="http://schemas.microsoft.com/office/word/2012/wordml" xmlns:wpg="http://schemas.microsoft.com/office/word/2010/wordprocessingGroup" xmlns:wpi="http://schemas.microsoft.com/office/word/2010/wordprocessingInk" xmlns:wne="http://schemas.microsoft.com/office/word/2006/wordml" xmlns:wps="http://schemas.microsoft.com/office/word/2010/wordprocessingShape" xmlns:wpsCustomData="http://www.wps.cn/officeDocument/2013/wpsCustomData" mc:Ignorable="w14 w15 wp14">
   <w:p>
     <w:pPr>
-      <w:pStyle w:val="Header"/>
       <w:spacing w:line="480" w:lineRule="auto"/>
     </w:pPr>
   </w:p>
@@ -2004,10 +2046,9 @@
 </file>
 
 <file path=word/header2.xml><?xml version="1.0" encoding="utf-8"?>
-<w:hdr xmlns:m="http://schemas.openxmlformats.org/officeDocument/2006/math" xmlns:mc="http://schemas.openxmlformats.org/markup-compatibility/2006" xmlns:mo="http://schemas.microsoft.com/office/mac/office/2008/main" xmlns:mv="urn:schemas-microsoft-com:mac:vml" xmlns:o="urn:schemas-microsoft-com:office:office" xmlns:r="http://schemas.openxmlformats.org/officeDocument/2006/relationships" xmlns:v="urn:schemas-microsoft-com:vml" xmlns:w10="urn:schemas-microsoft-com:office:word" xmlns:w14="http://schemas.microsoft.com/office/word/2010/wordml" xmlns:w="http://schemas.openxmlformats.org/wordprocessingml/2006/main" xmlns:wne="http://schemas.microsoft.com/office/word/2006/wordml" xmlns:wp14="http://schemas.microsoft.com/office/word/2010/wordprocessingDrawing" xmlns:wp="http://schemas.openxmlformats.org/drawingml/2006/wordprocessingDrawing" xmlns:wpc="http://schemas.microsoft.com/office/word/2010/wordprocessingCanvas" xmlns:wpg="http://schemas.microsoft.com/office/word/2010/wordprocessingGroup" xmlns:wpi="http://schemas.microsoft.com/office/word/2010/wordprocessingInk" xmlns:wps="http://schemas.microsoft.com/office/word/2010/wordprocessingShape" mc:Ignorable="w14 wp14">
+<w:hdr xmlns:wpc="http://schemas.microsoft.com/office/word/2010/wordprocessingCanvas" xmlns:mc="http://schemas.openxmlformats.org/markup-compatibility/2006" xmlns:o="urn:schemas-microsoft-com:office:office" xmlns:r="http://schemas.openxmlformats.org/officeDocument/2006/relationships" xmlns:m="http://schemas.openxmlformats.org/officeDocument/2006/math" xmlns:v="urn:schemas-microsoft-com:vml" xmlns:wp14="http://schemas.microsoft.com/office/word/2010/wordprocessingDrawing" xmlns:wp="http://schemas.openxmlformats.org/drawingml/2006/wordprocessingDrawing" xmlns:w10="urn:schemas-microsoft-com:office:word" xmlns:w="http://schemas.openxmlformats.org/wordprocessingml/2006/main" xmlns:w14="http://schemas.microsoft.com/office/word/2010/wordml" xmlns:w15="http://schemas.microsoft.com/office/word/2012/wordml" xmlns:wpg="http://schemas.microsoft.com/office/word/2010/wordprocessingGroup" xmlns:wpi="http://schemas.microsoft.com/office/word/2010/wordprocessingInk" xmlns:wne="http://schemas.microsoft.com/office/word/2006/wordml" xmlns:wps="http://schemas.microsoft.com/office/word/2010/wordprocessingShape" xmlns:wpsCustomData="http://www.wps.cn/officeDocument/2013/wpsCustomData" mc:Ignorable="w14 w15 wp14">
   <w:p>
     <w:pPr>
-      <w:pStyle w:val="Header"/>
       <w:spacing w:line="480" w:lineRule="auto"/>
     </w:pPr>
   </w:p>
@@ -2015,10 +2056,9 @@
 </file>
 
 <file path=word/header3.xml><?xml version="1.0" encoding="utf-8"?>
-<w:hdr xmlns:m="http://schemas.openxmlformats.org/officeDocument/2006/math" xmlns:mc="http://schemas.openxmlformats.org/markup-compatibility/2006" xmlns:mo="http://schemas.microsoft.com/office/mac/office/2008/main" xmlns:mv="urn:schemas-microsoft-com:mac:vml" xmlns:o="urn:schemas-microsoft-com:office:office" xmlns:r="http://schemas.openxmlformats.org/officeDocument/2006/relationships" xmlns:v="urn:schemas-microsoft-com:vml" xmlns:w10="urn:schemas-microsoft-com:office:word" xmlns:w14="http://schemas.microsoft.com/office/word/2010/wordml" xmlns:w="http://schemas.openxmlformats.org/wordprocessingml/2006/main" xmlns:wne="http://schemas.microsoft.com/office/word/2006/wordml" xmlns:wp14="http://schemas.microsoft.com/office/word/2010/wordprocessingDrawing" xmlns:wp="http://schemas.openxmlformats.org/drawingml/2006/wordprocessingDrawing" xmlns:wpc="http://schemas.microsoft.com/office/word/2010/wordprocessingCanvas" xmlns:wpg="http://schemas.microsoft.com/office/word/2010/wordprocessingGroup" xmlns:wpi="http://schemas.microsoft.com/office/word/2010/wordprocessingInk" xmlns:wps="http://schemas.microsoft.com/office/word/2010/wordprocessingShape" mc:Ignorable="w14 wp14">
+<w:hdr xmlns:wpc="http://schemas.microsoft.com/office/word/2010/wordprocessingCanvas" xmlns:mc="http://schemas.openxmlformats.org/markup-compatibility/2006" xmlns:o="urn:schemas-microsoft-com:office:office" xmlns:r="http://schemas.openxmlformats.org/officeDocument/2006/relationships" xmlns:m="http://schemas.openxmlformats.org/officeDocument/2006/math" xmlns:v="urn:schemas-microsoft-com:vml" xmlns:wp14="http://schemas.microsoft.com/office/word/2010/wordprocessingDrawing" xmlns:wp="http://schemas.openxmlformats.org/drawingml/2006/wordprocessingDrawing" xmlns:w10="urn:schemas-microsoft-com:office:word" xmlns:w="http://schemas.openxmlformats.org/wordprocessingml/2006/main" xmlns:w14="http://schemas.microsoft.com/office/word/2010/wordml" xmlns:w15="http://schemas.microsoft.com/office/word/2012/wordml" xmlns:wpg="http://schemas.microsoft.com/office/word/2010/wordprocessingGroup" xmlns:wpi="http://schemas.microsoft.com/office/word/2010/wordprocessingInk" xmlns:wne="http://schemas.microsoft.com/office/word/2006/wordml" xmlns:wps="http://schemas.microsoft.com/office/word/2010/wordprocessingShape" xmlns:wpsCustomData="http://www.wps.cn/officeDocument/2013/wpsCustomData" mc:Ignorable="w14 w15 wp14">
   <w:p>
     <w:pPr>
-      <w:pStyle w:val="Header"/>
       <w:spacing w:line="480" w:lineRule="auto"/>
     </w:pPr>
   </w:p>
@@ -2113,26 +2153,11 @@
       </w:pPr>
     </w:lvl>
   </w:abstractNum>
-  <w:abstractNum w:abstractNumId="1">
-    <w:nsid w:val="268C56C2"/>
-    <w:multiLevelType w:val="singleLevel"/>
-    <w:tmpl w:val="268C56C2"/>
-    <w:lvl w:ilvl="0" w:tentative="0">
-      <w:start w:val="1"/>
-      <w:numFmt w:val="decimal"/>
-      <w:suff w:val="space"/>
-      <w:lvlText w:val="%1."/>
-      <w:lvlJc w:val="left"/>
-    </w:lvl>
-  </w:abstractNum>
   <w:num w:numId="1">
     <w:abstractNumId w:val="0"/>
     <w:lvlOverride w:ilvl="0">
       <w:startOverride w:val="1"/>
     </w:lvlOverride>
-  </w:num>
-  <w:num w:numId="2">
-    <w:abstractNumId w:val="1"/>
   </w:num>
 </w:numbering>
 </file>
@@ -2142,10 +2167,7 @@
   <w:docDefaults>
     <w:rPrDefault>
       <w:rPr>
-        <w:rFonts w:asciiTheme="minorHAnsi" w:hAnsiTheme="minorHAnsi" w:eastAsiaTheme="minorEastAsia" w:cstheme="minorBidi" w:ascii="Times New Roman" w:hAnsi="Times New Roman" w:eastAsia="Times New Roman" w:cs="Times New Roman"/>
-        <w:color w:val="000000"/>
-        <w:sz w:val="24"/>
-        <w:szCs w:val="24"/>
+        <w:rFonts w:asciiTheme="minorHAnsi" w:hAnsiTheme="minorHAnsi" w:eastAsiaTheme="minorEastAsia" w:cstheme="minorBidi"/>
       </w:rPr>
     </w:rPrDefault>
     <w:pPrDefault/>
@@ -2180,7 +2202,7 @@
     <w:lsdException w:unhideWhenUsed="0" w:uiPriority="0" w:semiHidden="0" w:name="toc 8"/>
     <w:lsdException w:unhideWhenUsed="0" w:uiPriority="0" w:semiHidden="0" w:name="toc 9"/>
     <w:lsdException w:unhideWhenUsed="0" w:uiPriority="0" w:semiHidden="0" w:name="Normal Indent"/>
-    <w:lsdException w:uiPriority="99" w:name="footnote text"/>
+    <w:lsdException w:qFormat="1" w:uiPriority="99" w:name="footnote text"/>
     <w:lsdException w:unhideWhenUsed="0" w:uiPriority="0" w:semiHidden="0" w:name="annotation text"/>
     <w:lsdException w:unhideWhenUsed="0" w:uiPriority="0" w:semiHidden="0" w:name="header"/>
     <w:lsdException w:unhideWhenUsed="0" w:uiPriority="0" w:semiHidden="0" w:name="footer"/>
@@ -2189,7 +2211,7 @@
     <w:lsdException w:unhideWhenUsed="0" w:uiPriority="0" w:semiHidden="0" w:name="table of figures"/>
     <w:lsdException w:unhideWhenUsed="0" w:uiPriority="0" w:semiHidden="0" w:name="envelope address"/>
     <w:lsdException w:unhideWhenUsed="0" w:uiPriority="0" w:semiHidden="0" w:name="envelope return"/>
-    <w:lsdException w:uiPriority="99" w:name="footnote reference"/>
+    <w:lsdException w:qFormat="1" w:uiPriority="99" w:name="footnote reference"/>
     <w:lsdException w:unhideWhenUsed="0" w:uiPriority="0" w:semiHidden="0" w:name="annotation reference"/>
     <w:lsdException w:unhideWhenUsed="0" w:uiPriority="0" w:semiHidden="0" w:name="line number"/>
     <w:lsdException w:unhideWhenUsed="0" w:uiPriority="0" w:semiHidden="0" w:name="page number"/>
@@ -2236,7 +2258,7 @@
     <w:lsdException w:unhideWhenUsed="0" w:uiPriority="0" w:semiHidden="0" w:name="Body Text Indent 2"/>
     <w:lsdException w:unhideWhenUsed="0" w:uiPriority="0" w:semiHidden="0" w:name="Body Text Indent 3"/>
     <w:lsdException w:unhideWhenUsed="0" w:uiPriority="0" w:semiHidden="0" w:name="Block Text"/>
-    <w:lsdException w:uiPriority="99" w:semiHidden="0" w:name="Hyperlink"/>
+    <w:lsdException w:qFormat="1" w:uiPriority="99" w:semiHidden="0" w:name="Hyperlink"/>
     <w:lsdException w:unhideWhenUsed="0" w:uiPriority="0" w:semiHidden="0" w:name="FollowedHyperlink"/>
     <w:lsdException w:qFormat="1" w:unhideWhenUsed="0" w:uiPriority="0" w:semiHidden="0" w:name="Strong"/>
     <w:lsdException w:qFormat="1" w:unhideWhenUsed="0" w:uiPriority="0" w:semiHidden="0" w:name="Emphasis"/>
@@ -2525,8 +2547,8 @@
       <w:rFonts w:ascii="Times New Roman" w:hAnsi="Times New Roman" w:eastAsia="Times New Roman" w:cs="Times New Roman"/>
       <w:color w:val="000000"/>
       <w:sz w:val="24"/>
+      <w:szCs w:val="24"/>
       <w:vertAlign w:val="superscript"/>
-      <w:szCs w:val="24"/>
     </w:rPr>
   </w:style>
   <w:style w:type="paragraph" w:styleId="11">
@@ -2549,13 +2571,14 @@
     <w:name w:val="footnote reference"/>
     <w:semiHidden/>
     <w:unhideWhenUsed/>
+    <w:qFormat/>
     <w:uiPriority w:val="99"/>
     <w:rPr>
       <w:rFonts w:ascii="Times New Roman" w:hAnsi="Times New Roman" w:eastAsia="Times New Roman" w:cs="Times New Roman"/>
       <w:color w:val="000000"/>
       <w:sz w:val="24"/>
+      <w:szCs w:val="24"/>
       <w:vertAlign w:val="superscript"/>
-      <w:szCs w:val="24"/>
     </w:rPr>
   </w:style>
   <w:style w:type="paragraph" w:styleId="13">
@@ -2563,6 +2586,7 @@
     <w:link w:val="17"/>
     <w:semiHidden/>
     <w:unhideWhenUsed/>
+    <w:qFormat/>
     <w:uiPriority w:val="99"/>
     <w:pPr>
       <w:spacing w:after="0" w:line="240" w:lineRule="auto"/>
@@ -2577,13 +2601,14 @@
   <w:style w:type="character" w:styleId="14">
     <w:name w:val="Hyperlink"/>
     <w:unhideWhenUsed/>
+    <w:qFormat/>
     <w:uiPriority w:val="99"/>
     <w:rPr>
       <w:rFonts w:ascii="Times New Roman" w:hAnsi="Times New Roman" w:eastAsia="Times New Roman" w:cs="Times New Roman"/>
       <w:color w:val="000000"/>
       <w:sz w:val="24"/>
+      <w:szCs w:val="24"/>
       <w:u w:val="single"/>
-      <w:szCs w:val="24"/>
     </w:rPr>
   </w:style>
   <w:style w:type="paragraph" w:styleId="15">
@@ -2626,6 +2651,7 @@
     <w:link w:val="11"/>
     <w:semiHidden/>
     <w:unhideWhenUsed/>
+    <w:qFormat/>
     <w:uiPriority w:val="99"/>
     <w:rPr>
       <w:rFonts w:ascii="Times New Roman" w:hAnsi="Times New Roman" w:eastAsia="Times New Roman" w:cs="Times New Roman"/>

</xml_diff>